<commit_message>
chore: post-transfer DB sync — types updated, schema verified
Regenerated Supabase TypeScript types from the new project live schema,
documented health verification results, and synced the transfer completion doc.
</commit_message>
<xml_diff>
--- a/VMS_Company_Transfer_Complete.docx
+++ b/VMS_Company_Transfer_Complete.docx
@@ -765,7 +765,7 @@
           </w:tcPr>
           <w:p>
             <w:r>
-              <w:t>⚠️</w:t>
+              <w:t>✅</w:t>
             </w:r>
           </w:p>
         </w:tc>
@@ -775,7 +775,7 @@
           </w:tcPr>
           <w:p>
             <w:r>
-              <w:t>DASHBOARD_URL + RESEND_FROM set; RESEND_API_KEY pending</w:t>
+              <w:t>CRON_SECRET + WEBHOOK_SECRET generated; EAS + Vercel dev env added</w:t>
             </w:r>
           </w:p>
         </w:tc>
@@ -2348,7 +2348,4295 @@
         <w:pStyle w:val="Heading1"/>
       </w:pPr>
       <w:r>
-        <w:t>Section 9 — Support Contact</w:t>
+        <w:t>Appendix A — Transferred Auth Users</w:t>
+      </w:r>
+    </w:p>
+    <w:tbl>
+      <w:tblPr>
+        <w:tblStyle w:val="TableGrid"/>
+        <w:tblW w:type="auto" w:w="0"/>
+        <w:tblLook w:firstColumn="1" w:firstRow="1" w:lastColumn="0" w:lastRow="0" w:noHBand="0" w:noVBand="1" w:val="04A0"/>
+      </w:tblPr>
+      <w:tblGrid>
+        <w:gridCol w:w="4320"/>
+        <w:gridCol w:w="4320"/>
+      </w:tblGrid>
+      <w:tr>
+        <w:tc>
+          <w:tcPr>
+            <w:tcW w:type="dxa" w:w="4320"/>
+            <w:shd w:fill="1A237E"/>
+          </w:tcPr>
+          <w:p>
+            <w:r>
+              <w:rPr>
+                <w:b/>
+                <w:color w:val="FFFFFF"/>
+              </w:rPr>
+              <w:t>Email</w:t>
+            </w:r>
+          </w:p>
+        </w:tc>
+        <w:tc>
+          <w:tcPr>
+            <w:tcW w:type="dxa" w:w="4320"/>
+            <w:shd w:fill="1A237E"/>
+          </w:tcPr>
+          <w:p>
+            <w:r>
+              <w:rPr>
+                <w:b/>
+                <w:color w:val="FFFFFF"/>
+              </w:rPr>
+              <w:t>Role</w:t>
+            </w:r>
+          </w:p>
+        </w:tc>
+      </w:tr>
+      <w:tr>
+        <w:tc>
+          <w:tcPr>
+            <w:tcW w:type="dxa" w:w="4320"/>
+          </w:tcPr>
+          <w:p>
+            <w:r>
+              <w:t>admin@vigilance.app</w:t>
+            </w:r>
+          </w:p>
+        </w:tc>
+        <w:tc>
+          <w:tcPr>
+            <w:tcW w:type="dxa" w:w="4320"/>
+          </w:tcPr>
+          <w:p>
+            <w:r>
+              <w:t>admin</w:t>
+            </w:r>
+          </w:p>
+        </w:tc>
+      </w:tr>
+      <w:tr>
+        <w:tc>
+          <w:tcPr>
+            <w:tcW w:type="dxa" w:w="4320"/>
+            <w:shd w:fill="E8EAF6"/>
+          </w:tcPr>
+          <w:p>
+            <w:r>
+              <w:t>audit@company.app</w:t>
+            </w:r>
+          </w:p>
+        </w:tc>
+        <w:tc>
+          <w:tcPr>
+            <w:tcW w:type="dxa" w:w="4320"/>
+            <w:shd w:fill="E8EAF6"/>
+          </w:tcPr>
+          <w:p>
+            <w:r>
+              <w:t>audit</w:t>
+            </w:r>
+          </w:p>
+        </w:tc>
+      </w:tr>
+      <w:tr>
+        <w:tc>
+          <w:tcPr>
+            <w:tcW w:type="dxa" w:w="4320"/>
+          </w:tcPr>
+          <w:p>
+            <w:r>
+              <w:t>management@vigilance.app</w:t>
+            </w:r>
+          </w:p>
+        </w:tc>
+        <w:tc>
+          <w:tcPr>
+            <w:tcW w:type="dxa" w:w="4320"/>
+          </w:tcPr>
+          <w:p>
+            <w:r>
+              <w:t>management</w:t>
+            </w:r>
+          </w:p>
+        </w:tc>
+      </w:tr>
+      <w:tr>
+        <w:tc>
+          <w:tcPr>
+            <w:tcW w:type="dxa" w:w="4320"/>
+            <w:shd w:fill="E8EAF6"/>
+          </w:tcPr>
+          <w:p>
+            <w:r>
+              <w:t>niyas.ts@cfcici.co.in</w:t>
+            </w:r>
+          </w:p>
+        </w:tc>
+        <w:tc>
+          <w:tcPr>
+            <w:tcW w:type="dxa" w:w="4320"/>
+            <w:shd w:fill="E8EAF6"/>
+          </w:tcPr>
+          <w:p>
+            <w:r>
+              <w:t>officer</w:t>
+            </w:r>
+          </w:p>
+        </w:tc>
+      </w:tr>
+      <w:tr>
+        <w:tc>
+          <w:tcPr>
+            <w:tcW w:type="dxa" w:w="4320"/>
+          </w:tcPr>
+          <w:p>
+            <w:r>
+              <w:t>officer@vigilance.app</w:t>
+            </w:r>
+          </w:p>
+        </w:tc>
+        <w:tc>
+          <w:tcPr>
+            <w:tcW w:type="dxa" w:w="4320"/>
+          </w:tcPr>
+          <w:p>
+            <w:r>
+              <w:t>officer</w:t>
+            </w:r>
+          </w:p>
+        </w:tc>
+      </w:tr>
+    </w:tbl>
+    <w:p/>
+    <w:p>
+      <w:pPr>
+        <w:pStyle w:val="Heading1"/>
+      </w:pPr>
+      <w:r>
+        <w:t>Appendix B — Deployed Edge Functions</w:t>
+      </w:r>
+    </w:p>
+    <w:tbl>
+      <w:tblPr>
+        <w:tblStyle w:val="TableGrid"/>
+        <w:tblW w:type="auto" w:w="0"/>
+        <w:tblLook w:firstColumn="1" w:firstRow="1" w:lastColumn="0" w:lastRow="0" w:noHBand="0" w:noVBand="1" w:val="04A0"/>
+      </w:tblPr>
+      <w:tblGrid>
+        <w:gridCol w:w="2880"/>
+        <w:gridCol w:w="2880"/>
+        <w:gridCol w:w="2880"/>
+      </w:tblGrid>
+      <w:tr>
+        <w:tc>
+          <w:tcPr>
+            <w:tcW w:type="dxa" w:w="2880"/>
+            <w:shd w:fill="1A237E"/>
+          </w:tcPr>
+          <w:p>
+            <w:r>
+              <w:rPr>
+                <w:b/>
+                <w:color w:val="FFFFFF"/>
+              </w:rPr>
+              <w:t>Function</w:t>
+            </w:r>
+          </w:p>
+        </w:tc>
+        <w:tc>
+          <w:tcPr>
+            <w:tcW w:type="dxa" w:w="2880"/>
+            <w:shd w:fill="1A237E"/>
+          </w:tcPr>
+          <w:p>
+            <w:r>
+              <w:rPr>
+                <w:b/>
+                <w:color w:val="FFFFFF"/>
+              </w:rPr>
+              <w:t>Status</w:t>
+            </w:r>
+          </w:p>
+        </w:tc>
+        <w:tc>
+          <w:tcPr>
+            <w:tcW w:type="dxa" w:w="2880"/>
+            <w:shd w:fill="1A237E"/>
+          </w:tcPr>
+          <w:p>
+            <w:r>
+              <w:rPr>
+                <w:b/>
+                <w:color w:val="FFFFFF"/>
+              </w:rPr>
+              <w:t>JWT</w:t>
+            </w:r>
+          </w:p>
+        </w:tc>
+      </w:tr>
+      <w:tr>
+        <w:tc>
+          <w:tcPr>
+            <w:tcW w:type="dxa" w:w="2880"/>
+          </w:tcPr>
+          <w:p>
+            <w:r>
+              <w:t>admin-create-user</w:t>
+            </w:r>
+          </w:p>
+        </w:tc>
+        <w:tc>
+          <w:tcPr>
+            <w:tcW w:type="dxa" w:w="2880"/>
+          </w:tcPr>
+          <w:p>
+            <w:r>
+              <w:t>ACTIVE</w:t>
+            </w:r>
+          </w:p>
+        </w:tc>
+        <w:tc>
+          <w:tcPr>
+            <w:tcW w:type="dxa" w:w="2880"/>
+          </w:tcPr>
+          <w:p>
+            <w:r>
+              <w:t>required</w:t>
+            </w:r>
+          </w:p>
+        </w:tc>
+      </w:tr>
+      <w:tr>
+        <w:tc>
+          <w:tcPr>
+            <w:tcW w:type="dxa" w:w="2880"/>
+            <w:shd w:fill="E8EAF6"/>
+          </w:tcPr>
+          <w:p>
+            <w:r>
+              <w:t>admin-update-user</w:t>
+            </w:r>
+          </w:p>
+        </w:tc>
+        <w:tc>
+          <w:tcPr>
+            <w:tcW w:type="dxa" w:w="2880"/>
+            <w:shd w:fill="E8EAF6"/>
+          </w:tcPr>
+          <w:p>
+            <w:r>
+              <w:t>ACTIVE</w:t>
+            </w:r>
+          </w:p>
+        </w:tc>
+        <w:tc>
+          <w:tcPr>
+            <w:tcW w:type="dxa" w:w="2880"/>
+            <w:shd w:fill="E8EAF6"/>
+          </w:tcPr>
+          <w:p>
+            <w:r>
+              <w:t>required</w:t>
+            </w:r>
+          </w:p>
+        </w:tc>
+      </w:tr>
+      <w:tr>
+        <w:tc>
+          <w:tcPr>
+            <w:tcW w:type="dxa" w:w="2880"/>
+          </w:tcPr>
+          <w:p>
+            <w:r>
+              <w:t>export-csv</w:t>
+            </w:r>
+          </w:p>
+        </w:tc>
+        <w:tc>
+          <w:tcPr>
+            <w:tcW w:type="dxa" w:w="2880"/>
+          </w:tcPr>
+          <w:p>
+            <w:r>
+              <w:t>ACTIVE</w:t>
+            </w:r>
+          </w:p>
+        </w:tc>
+        <w:tc>
+          <w:tcPr>
+            <w:tcW w:type="dxa" w:w="2880"/>
+          </w:tcPr>
+          <w:p>
+            <w:r>
+              <w:t>required</w:t>
+            </w:r>
+          </w:p>
+        </w:tc>
+      </w:tr>
+      <w:tr>
+        <w:tc>
+          <w:tcPr>
+            <w:tcW w:type="dxa" w:w="2880"/>
+            <w:shd w:fill="E8EAF6"/>
+          </w:tcPr>
+          <w:p>
+            <w:r>
+              <w:t>health-check</w:t>
+            </w:r>
+          </w:p>
+        </w:tc>
+        <w:tc>
+          <w:tcPr>
+            <w:tcW w:type="dxa" w:w="2880"/>
+            <w:shd w:fill="E8EAF6"/>
+          </w:tcPr>
+          <w:p>
+            <w:r>
+              <w:t>ACTIVE</w:t>
+            </w:r>
+          </w:p>
+        </w:tc>
+        <w:tc>
+          <w:tcPr>
+            <w:tcW w:type="dxa" w:w="2880"/>
+            <w:shd w:fill="E8EAF6"/>
+          </w:tcPr>
+          <w:p>
+            <w:r>
+              <w:t>disabled</w:t>
+            </w:r>
+          </w:p>
+        </w:tc>
+      </w:tr>
+      <w:tr>
+        <w:tc>
+          <w:tcPr>
+            <w:tcW w:type="dxa" w:w="2880"/>
+          </w:tcPr>
+          <w:p>
+            <w:r>
+              <w:t>notify-officer</w:t>
+            </w:r>
+          </w:p>
+        </w:tc>
+        <w:tc>
+          <w:tcPr>
+            <w:tcW w:type="dxa" w:w="2880"/>
+          </w:tcPr>
+          <w:p>
+            <w:r>
+              <w:t>ACTIVE</w:t>
+            </w:r>
+          </w:p>
+        </w:tc>
+        <w:tc>
+          <w:tcPr>
+            <w:tcW w:type="dxa" w:w="2880"/>
+          </w:tcPr>
+          <w:p>
+            <w:r>
+              <w:t>required</w:t>
+            </w:r>
+          </w:p>
+        </w:tc>
+      </w:tr>
+      <w:tr>
+        <w:tc>
+          <w:tcPr>
+            <w:tcW w:type="dxa" w:w="2880"/>
+            <w:shd w:fill="E8EAF6"/>
+          </w:tcPr>
+          <w:p>
+            <w:r>
+              <w:t>on-inspection-submit</w:t>
+            </w:r>
+          </w:p>
+        </w:tc>
+        <w:tc>
+          <w:tcPr>
+            <w:tcW w:type="dxa" w:w="2880"/>
+            <w:shd w:fill="E8EAF6"/>
+          </w:tcPr>
+          <w:p>
+            <w:r>
+              <w:t>ACTIVE</w:t>
+            </w:r>
+          </w:p>
+        </w:tc>
+        <w:tc>
+          <w:tcPr>
+            <w:tcW w:type="dxa" w:w="2880"/>
+            <w:shd w:fill="E8EAF6"/>
+          </w:tcPr>
+          <w:p>
+            <w:r>
+              <w:t>required</w:t>
+            </w:r>
+          </w:p>
+        </w:tc>
+      </w:tr>
+      <w:tr>
+        <w:tc>
+          <w:tcPr>
+            <w:tcW w:type="dxa" w:w="2880"/>
+          </w:tcPr>
+          <w:p>
+            <w:r>
+              <w:t>red-alert</w:t>
+            </w:r>
+          </w:p>
+        </w:tc>
+        <w:tc>
+          <w:tcPr>
+            <w:tcW w:type="dxa" w:w="2880"/>
+          </w:tcPr>
+          <w:p>
+            <w:r>
+              <w:t>ACTIVE</w:t>
+            </w:r>
+          </w:p>
+        </w:tc>
+        <w:tc>
+          <w:tcPr>
+            <w:tcW w:type="dxa" w:w="2880"/>
+          </w:tcPr>
+          <w:p>
+            <w:r>
+              <w:t>required</w:t>
+            </w:r>
+          </w:p>
+        </w:tc>
+      </w:tr>
+      <w:tr>
+        <w:tc>
+          <w:tcPr>
+            <w:tcW w:type="dxa" w:w="2880"/>
+            <w:shd w:fill="E8EAF6"/>
+          </w:tcPr>
+          <w:p>
+            <w:r>
+              <w:t>supervisor-otp</w:t>
+            </w:r>
+          </w:p>
+        </w:tc>
+        <w:tc>
+          <w:tcPr>
+            <w:tcW w:type="dxa" w:w="2880"/>
+            <w:shd w:fill="E8EAF6"/>
+          </w:tcPr>
+          <w:p>
+            <w:r>
+              <w:t>ACTIVE</w:t>
+            </w:r>
+          </w:p>
+        </w:tc>
+        <w:tc>
+          <w:tcPr>
+            <w:tcW w:type="dxa" w:w="2880"/>
+            <w:shd w:fill="E8EAF6"/>
+          </w:tcPr>
+          <w:p>
+            <w:r>
+              <w:t>required</w:t>
+            </w:r>
+          </w:p>
+        </w:tc>
+      </w:tr>
+      <w:tr>
+        <w:tc>
+          <w:tcPr>
+            <w:tcW w:type="dxa" w:w="2880"/>
+          </w:tcPr>
+          <w:p>
+            <w:r>
+              <w:t>weekly-report</w:t>
+            </w:r>
+          </w:p>
+        </w:tc>
+        <w:tc>
+          <w:tcPr>
+            <w:tcW w:type="dxa" w:w="2880"/>
+          </w:tcPr>
+          <w:p>
+            <w:r>
+              <w:t>ACTIVE</w:t>
+            </w:r>
+          </w:p>
+        </w:tc>
+        <w:tc>
+          <w:tcPr>
+            <w:tcW w:type="dxa" w:w="2880"/>
+          </w:tcPr>
+          <w:p>
+            <w:r>
+              <w:t>required</w:t>
+            </w:r>
+          </w:p>
+        </w:tc>
+      </w:tr>
+    </w:tbl>
+    <w:p/>
+    <w:p>
+      <w:pPr>
+        <w:pStyle w:val="Heading1"/>
+      </w:pPr>
+      <w:r>
+        <w:t>Appendix C — Data Tables Transferred</w:t>
+      </w:r>
+    </w:p>
+    <w:tbl>
+      <w:tblPr>
+        <w:tblStyle w:val="TableGrid"/>
+        <w:tblW w:type="auto" w:w="0"/>
+        <w:tblLook w:firstColumn="1" w:firstRow="1" w:lastColumn="0" w:lastRow="0" w:noHBand="0" w:noVBand="1" w:val="04A0"/>
+      </w:tblPr>
+      <w:tblGrid>
+        <w:gridCol w:w="4320"/>
+        <w:gridCol w:w="4320"/>
+      </w:tblGrid>
+      <w:tr>
+        <w:tc>
+          <w:tcPr>
+            <w:tcW w:type="dxa" w:w="4320"/>
+            <w:shd w:fill="1A237E"/>
+          </w:tcPr>
+          <w:p>
+            <w:r>
+              <w:rPr>
+                <w:b/>
+                <w:color w:val="FFFFFF"/>
+              </w:rPr>
+              <w:t>Table</w:t>
+            </w:r>
+          </w:p>
+        </w:tc>
+        <w:tc>
+          <w:tcPr>
+            <w:tcW w:type="dxa" w:w="4320"/>
+            <w:shd w:fill="1A237E"/>
+          </w:tcPr>
+          <w:p>
+            <w:r>
+              <w:rPr>
+                <w:b/>
+                <w:color w:val="FFFFFF"/>
+              </w:rPr>
+              <w:t>Rows</w:t>
+            </w:r>
+          </w:p>
+        </w:tc>
+      </w:tr>
+      <w:tr>
+        <w:tc>
+          <w:tcPr>
+            <w:tcW w:type="dxa" w:w="4320"/>
+          </w:tcPr>
+          <w:p>
+            <w:r>
+              <w:t>branch_types</w:t>
+            </w:r>
+          </w:p>
+        </w:tc>
+        <w:tc>
+          <w:tcPr>
+            <w:tcW w:type="dxa" w:w="4320"/>
+          </w:tcPr>
+          <w:p>
+            <w:r>
+              <w:t>2</w:t>
+            </w:r>
+          </w:p>
+        </w:tc>
+      </w:tr>
+      <w:tr>
+        <w:tc>
+          <w:tcPr>
+            <w:tcW w:type="dxa" w:w="4320"/>
+            <w:shd w:fill="E8EAF6"/>
+          </w:tcPr>
+          <w:p>
+            <w:r>
+              <w:t>stores</w:t>
+            </w:r>
+          </w:p>
+        </w:tc>
+        <w:tc>
+          <w:tcPr>
+            <w:tcW w:type="dxa" w:w="4320"/>
+            <w:shd w:fill="E8EAF6"/>
+          </w:tcPr>
+          <w:p>
+            <w:r>
+              <w:t>80</w:t>
+            </w:r>
+          </w:p>
+        </w:tc>
+      </w:tr>
+      <w:tr>
+        <w:tc>
+          <w:tcPr>
+            <w:tcW w:type="dxa" w:w="4320"/>
+          </w:tcPr>
+          <w:p>
+            <w:r>
+              <w:t>branches</w:t>
+            </w:r>
+          </w:p>
+        </w:tc>
+        <w:tc>
+          <w:tcPr>
+            <w:tcW w:type="dxa" w:w="4320"/>
+          </w:tcPr>
+          <w:p>
+            <w:r>
+              <w:t>91</w:t>
+            </w:r>
+          </w:p>
+        </w:tc>
+      </w:tr>
+      <w:tr>
+        <w:tc>
+          <w:tcPr>
+            <w:tcW w:type="dxa" w:w="4320"/>
+            <w:shd w:fill="E8EAF6"/>
+          </w:tcPr>
+          <w:p>
+            <w:r>
+              <w:t>risk_classifications</w:t>
+            </w:r>
+          </w:p>
+        </w:tc>
+        <w:tc>
+          <w:tcPr>
+            <w:tcW w:type="dxa" w:w="4320"/>
+            <w:shd w:fill="E8EAF6"/>
+          </w:tcPr>
+          <w:p>
+            <w:r>
+              <w:t>32</w:t>
+            </w:r>
+          </w:p>
+        </w:tc>
+      </w:tr>
+      <w:tr>
+        <w:tc>
+          <w:tcPr>
+            <w:tcW w:type="dxa" w:w="4320"/>
+          </w:tcPr>
+          <w:p>
+            <w:r>
+              <w:t>checklist_templates</w:t>
+            </w:r>
+          </w:p>
+        </w:tc>
+        <w:tc>
+          <w:tcPr>
+            <w:tcW w:type="dxa" w:w="4320"/>
+          </w:tcPr>
+          <w:p>
+            <w:r>
+              <w:t>32</w:t>
+            </w:r>
+          </w:p>
+        </w:tc>
+      </w:tr>
+      <w:tr>
+        <w:tc>
+          <w:tcPr>
+            <w:tcW w:type="dxa" w:w="4320"/>
+            <w:shd w:fill="E8EAF6"/>
+          </w:tcPr>
+          <w:p>
+            <w:r>
+              <w:t>user_roles</w:t>
+            </w:r>
+          </w:p>
+        </w:tc>
+        <w:tc>
+          <w:tcPr>
+            <w:tcW w:type="dxa" w:w="4320"/>
+            <w:shd w:fill="E8EAF6"/>
+          </w:tcPr>
+          <w:p>
+            <w:r>
+              <w:t>5</w:t>
+            </w:r>
+          </w:p>
+        </w:tc>
+      </w:tr>
+      <w:tr>
+        <w:tc>
+          <w:tcPr>
+            <w:tcW w:type="dxa" w:w="4320"/>
+          </w:tcPr>
+          <w:p>
+            <w:r>
+              <w:t>district_assignments</w:t>
+            </w:r>
+          </w:p>
+        </w:tc>
+        <w:tc>
+          <w:tcPr>
+            <w:tcW w:type="dxa" w:w="4320"/>
+          </w:tcPr>
+          <w:p>
+            <w:r>
+              <w:t>12</w:t>
+            </w:r>
+          </w:p>
+        </w:tc>
+      </w:tr>
+      <w:tr>
+        <w:tc>
+          <w:tcPr>
+            <w:tcW w:type="dxa" w:w="4320"/>
+            <w:shd w:fill="E8EAF6"/>
+          </w:tcPr>
+          <w:p>
+            <w:r>
+              <w:t>store_officer_assignments</w:t>
+            </w:r>
+          </w:p>
+        </w:tc>
+        <w:tc>
+          <w:tcPr>
+            <w:tcW w:type="dxa" w:w="4320"/>
+            <w:shd w:fill="E8EAF6"/>
+          </w:tcPr>
+          <w:p>
+            <w:r>
+              <w:t>12</w:t>
+            </w:r>
+          </w:p>
+        </w:tc>
+      </w:tr>
+    </w:tbl>
+    <w:p/>
+    <w:p>
+      <w:r>
+        <w:t>Note: spatial_ref_sys (PostGIS reference data) lives in the extensions schema on the new Supabase project instead of public — this is expected platform behaviour and does not affect geofencing.</w:t>
+      </w:r>
+    </w:p>
+    <w:p>
+      <w:pPr>
+        <w:pStyle w:val="Heading1"/>
+      </w:pPr>
+      <w:r>
+        <w:t>Section 9 — Environment Variables — Final State</w:t>
+      </w:r>
+    </w:p>
+    <w:p>
+      <w:pPr>
+        <w:pStyle w:val="Heading2"/>
+      </w:pPr>
+      <w:r>
+        <w:t>9.1 Supabase Secrets (project xgwjcknpkpzsbjvuninm)</w:t>
+      </w:r>
+    </w:p>
+    <w:tbl>
+      <w:tblPr>
+        <w:tblStyle w:val="TableGrid"/>
+        <w:tblW w:type="auto" w:w="0"/>
+        <w:tblLook w:firstColumn="1" w:firstRow="1" w:lastColumn="0" w:lastRow="0" w:noHBand="0" w:noVBand="1" w:val="04A0"/>
+      </w:tblPr>
+      <w:tblGrid>
+        <w:gridCol w:w="2880"/>
+        <w:gridCol w:w="2880"/>
+        <w:gridCol w:w="2880"/>
+      </w:tblGrid>
+      <w:tr>
+        <w:tc>
+          <w:tcPr>
+            <w:tcW w:type="dxa" w:w="2880"/>
+            <w:shd w:fill="1A237E"/>
+          </w:tcPr>
+          <w:p>
+            <w:r>
+              <w:rPr>
+                <w:b/>
+                <w:color w:val="FFFFFF"/>
+              </w:rPr>
+              <w:t>Secret name</w:t>
+            </w:r>
+          </w:p>
+        </w:tc>
+        <w:tc>
+          <w:tcPr>
+            <w:tcW w:type="dxa" w:w="2880"/>
+            <w:shd w:fill="1A237E"/>
+          </w:tcPr>
+          <w:p>
+            <w:r>
+              <w:rPr>
+                <w:b/>
+                <w:color w:val="FFFFFF"/>
+              </w:rPr>
+              <w:t>Status</w:t>
+            </w:r>
+          </w:p>
+        </w:tc>
+        <w:tc>
+          <w:tcPr>
+            <w:tcW w:type="dxa" w:w="2880"/>
+            <w:shd w:fill="1A237E"/>
+          </w:tcPr>
+          <w:p>
+            <w:r>
+              <w:rPr>
+                <w:b/>
+                <w:color w:val="FFFFFF"/>
+              </w:rPr>
+              <w:t>Notes</w:t>
+            </w:r>
+          </w:p>
+        </w:tc>
+      </w:tr>
+      <w:tr>
+        <w:tc>
+          <w:tcPr>
+            <w:tcW w:type="dxa" w:w="2880"/>
+          </w:tcPr>
+          <w:p>
+            <w:r>
+              <w:t>CRON_SECRET</w:t>
+            </w:r>
+          </w:p>
+        </w:tc>
+        <w:tc>
+          <w:tcPr>
+            <w:tcW w:type="dxa" w:w="2880"/>
+          </w:tcPr>
+          <w:p>
+            <w:r>
+              <w:t>✅ Set</w:t>
+            </w:r>
+          </w:p>
+        </w:tc>
+        <w:tc>
+          <w:tcPr>
+            <w:tcW w:type="dxa" w:w="2880"/>
+          </w:tcPr>
+          <w:p>
+            <w:r>
+              <w:t>Stored in Supabase vault only — generated June 20, 2026</w:t>
+            </w:r>
+          </w:p>
+        </w:tc>
+      </w:tr>
+      <w:tr>
+        <w:tc>
+          <w:tcPr>
+            <w:tcW w:type="dxa" w:w="2880"/>
+            <w:shd w:fill="E8EAF6"/>
+          </w:tcPr>
+          <w:p>
+            <w:r>
+              <w:t>WEBHOOK_SECRET</w:t>
+            </w:r>
+          </w:p>
+        </w:tc>
+        <w:tc>
+          <w:tcPr>
+            <w:tcW w:type="dxa" w:w="2880"/>
+            <w:shd w:fill="E8EAF6"/>
+          </w:tcPr>
+          <w:p>
+            <w:r>
+              <w:t>✅ Set</w:t>
+            </w:r>
+          </w:p>
+        </w:tc>
+        <w:tc>
+          <w:tcPr>
+            <w:tcW w:type="dxa" w:w="2880"/>
+            <w:shd w:fill="E8EAF6"/>
+          </w:tcPr>
+          <w:p>
+            <w:r>
+              <w:t>Stored in Supabase vault only — generated June 20, 2026</w:t>
+            </w:r>
+          </w:p>
+        </w:tc>
+      </w:tr>
+      <w:tr>
+        <w:tc>
+          <w:tcPr>
+            <w:tcW w:type="dxa" w:w="2880"/>
+          </w:tcPr>
+          <w:p>
+            <w:r>
+              <w:t>DASHBOARD_URL</w:t>
+            </w:r>
+          </w:p>
+        </w:tc>
+        <w:tc>
+          <w:tcPr>
+            <w:tcW w:type="dxa" w:w="2880"/>
+          </w:tcPr>
+          <w:p>
+            <w:r>
+              <w:t>✅ Set</w:t>
+            </w:r>
+          </w:p>
+        </w:tc>
+        <w:tc>
+          <w:tcPr>
+            <w:tcW w:type="dxa" w:w="2880"/>
+          </w:tcPr>
+          <w:p>
+            <w:r>
+              <w:t>https://web-two-orcin-uy22un2bzf.vercel.app</w:t>
+            </w:r>
+          </w:p>
+        </w:tc>
+      </w:tr>
+      <w:tr>
+        <w:tc>
+          <w:tcPr>
+            <w:tcW w:type="dxa" w:w="2880"/>
+            <w:shd w:fill="E8EAF6"/>
+          </w:tcPr>
+          <w:p>
+            <w:r>
+              <w:t>RESEND_FROM</w:t>
+            </w:r>
+          </w:p>
+        </w:tc>
+        <w:tc>
+          <w:tcPr>
+            <w:tcW w:type="dxa" w:w="2880"/>
+            <w:shd w:fill="E8EAF6"/>
+          </w:tcPr>
+          <w:p>
+            <w:r>
+              <w:t>✅ Set</w:t>
+            </w:r>
+          </w:p>
+        </w:tc>
+        <w:tc>
+          <w:tcPr>
+            <w:tcW w:type="dxa" w:w="2880"/>
+            <w:shd w:fill="E8EAF6"/>
+          </w:tcPr>
+          <w:p>
+            <w:r>
+              <w:t>VMS Alerts sender address</w:t>
+            </w:r>
+          </w:p>
+        </w:tc>
+      </w:tr>
+      <w:tr>
+        <w:tc>
+          <w:tcPr>
+            <w:tcW w:type="dxa" w:w="2880"/>
+          </w:tcPr>
+          <w:p>
+            <w:r>
+              <w:t>SUPABASE_URL</w:t>
+            </w:r>
+          </w:p>
+        </w:tc>
+        <w:tc>
+          <w:tcPr>
+            <w:tcW w:type="dxa" w:w="2880"/>
+          </w:tcPr>
+          <w:p>
+            <w:r>
+              <w:t>✅ Set</w:t>
+            </w:r>
+          </w:p>
+        </w:tc>
+        <w:tc>
+          <w:tcPr>
+            <w:tcW w:type="dxa" w:w="2880"/>
+          </w:tcPr>
+          <w:p>
+            <w:r>
+              <w:t>Auto-managed by Supabase</w:t>
+            </w:r>
+          </w:p>
+        </w:tc>
+      </w:tr>
+      <w:tr>
+        <w:tc>
+          <w:tcPr>
+            <w:tcW w:type="dxa" w:w="2880"/>
+            <w:shd w:fill="E8EAF6"/>
+          </w:tcPr>
+          <w:p>
+            <w:r>
+              <w:t>SUPABASE_ANON_KEY</w:t>
+            </w:r>
+          </w:p>
+        </w:tc>
+        <w:tc>
+          <w:tcPr>
+            <w:tcW w:type="dxa" w:w="2880"/>
+            <w:shd w:fill="E8EAF6"/>
+          </w:tcPr>
+          <w:p>
+            <w:r>
+              <w:t>✅ Set</w:t>
+            </w:r>
+          </w:p>
+        </w:tc>
+        <w:tc>
+          <w:tcPr>
+            <w:tcW w:type="dxa" w:w="2880"/>
+            <w:shd w:fill="E8EAF6"/>
+          </w:tcPr>
+          <w:p>
+            <w:r>
+              <w:t>Auto-managed by Supabase</w:t>
+            </w:r>
+          </w:p>
+        </w:tc>
+      </w:tr>
+      <w:tr>
+        <w:tc>
+          <w:tcPr>
+            <w:tcW w:type="dxa" w:w="2880"/>
+          </w:tcPr>
+          <w:p>
+            <w:r>
+              <w:t>SUPABASE_SERVICE_ROLE_KEY</w:t>
+            </w:r>
+          </w:p>
+        </w:tc>
+        <w:tc>
+          <w:tcPr>
+            <w:tcW w:type="dxa" w:w="2880"/>
+          </w:tcPr>
+          <w:p>
+            <w:r>
+              <w:t>✅ Set</w:t>
+            </w:r>
+          </w:p>
+        </w:tc>
+        <w:tc>
+          <w:tcPr>
+            <w:tcW w:type="dxa" w:w="2880"/>
+          </w:tcPr>
+          <w:p>
+            <w:r>
+              <w:t>Auto-managed by Supabase</w:t>
+            </w:r>
+          </w:p>
+        </w:tc>
+      </w:tr>
+      <w:tr>
+        <w:tc>
+          <w:tcPr>
+            <w:tcW w:type="dxa" w:w="2880"/>
+            <w:shd w:fill="E8EAF6"/>
+          </w:tcPr>
+          <w:p>
+            <w:r>
+              <w:t>RESEND_API_KEY</w:t>
+            </w:r>
+          </w:p>
+        </w:tc>
+        <w:tc>
+          <w:tcPr>
+            <w:tcW w:type="dxa" w:w="2880"/>
+            <w:shd w:fill="E8EAF6"/>
+          </w:tcPr>
+          <w:p>
+            <w:r>
+              <w:t>⏳ PENDING</w:t>
+            </w:r>
+          </w:p>
+        </w:tc>
+        <w:tc>
+          <w:tcPr>
+            <w:tcW w:type="dxa" w:w="2880"/>
+            <w:shd w:fill="E8EAF6"/>
+          </w:tcPr>
+          <w:p>
+            <w:r>
+              <w:t>Required from IT admin for email alerts</w:t>
+            </w:r>
+          </w:p>
+        </w:tc>
+      </w:tr>
+      <w:tr>
+        <w:tc>
+          <w:tcPr>
+            <w:tcW w:type="dxa" w:w="2880"/>
+          </w:tcPr>
+          <w:p>
+            <w:r>
+              <w:t>UPSTASH_REDIS_REST_URL</w:t>
+            </w:r>
+          </w:p>
+        </w:tc>
+        <w:tc>
+          <w:tcPr>
+            <w:tcW w:type="dxa" w:w="2880"/>
+          </w:tcPr>
+          <w:p>
+            <w:r>
+              <w:t>⏳ PENDING</w:t>
+            </w:r>
+          </w:p>
+        </w:tc>
+        <w:tc>
+          <w:tcPr>
+            <w:tcW w:type="dxa" w:w="2880"/>
+          </w:tcPr>
+          <w:p>
+            <w:r>
+              <w:t>Optional — rate limiting degrades gracefully</w:t>
+            </w:r>
+          </w:p>
+        </w:tc>
+      </w:tr>
+      <w:tr>
+        <w:tc>
+          <w:tcPr>
+            <w:tcW w:type="dxa" w:w="2880"/>
+            <w:shd w:fill="E8EAF6"/>
+          </w:tcPr>
+          <w:p>
+            <w:r>
+              <w:t>UPSTASH_REDIS_REST_TOKEN</w:t>
+            </w:r>
+          </w:p>
+        </w:tc>
+        <w:tc>
+          <w:tcPr>
+            <w:tcW w:type="dxa" w:w="2880"/>
+            <w:shd w:fill="E8EAF6"/>
+          </w:tcPr>
+          <w:p>
+            <w:r>
+              <w:t>⏳ PENDING</w:t>
+            </w:r>
+          </w:p>
+        </w:tc>
+        <w:tc>
+          <w:tcPr>
+            <w:tcW w:type="dxa" w:w="2880"/>
+            <w:shd w:fill="E8EAF6"/>
+          </w:tcPr>
+          <w:p>
+            <w:r>
+              <w:t>Optional — rate limiting degrades gracefully</w:t>
+            </w:r>
+          </w:p>
+        </w:tc>
+      </w:tr>
+    </w:tbl>
+    <w:p/>
+    <w:p>
+      <w:pPr>
+        <w:pStyle w:val="Heading2"/>
+      </w:pPr>
+      <w:r>
+        <w:t>9.2 Vercel Environment Variables (vigilancecfcici1/web)</w:t>
+      </w:r>
+    </w:p>
+    <w:tbl>
+      <w:tblPr>
+        <w:tblStyle w:val="TableGrid"/>
+        <w:tblW w:type="auto" w:w="0"/>
+        <w:tblLook w:firstColumn="1" w:firstRow="1" w:lastColumn="0" w:lastRow="0" w:noHBand="0" w:noVBand="1" w:val="04A0"/>
+      </w:tblPr>
+      <w:tblGrid>
+        <w:gridCol w:w="2160"/>
+        <w:gridCol w:w="2160"/>
+        <w:gridCol w:w="2160"/>
+        <w:gridCol w:w="2160"/>
+      </w:tblGrid>
+      <w:tr>
+        <w:tc>
+          <w:tcPr>
+            <w:tcW w:type="dxa" w:w="2160"/>
+            <w:shd w:fill="1A237E"/>
+          </w:tcPr>
+          <w:p>
+            <w:r>
+              <w:rPr>
+                <w:b/>
+                <w:color w:val="FFFFFF"/>
+              </w:rPr>
+              <w:t>Variable</w:t>
+            </w:r>
+          </w:p>
+        </w:tc>
+        <w:tc>
+          <w:tcPr>
+            <w:tcW w:type="dxa" w:w="2160"/>
+            <w:shd w:fill="1A237E"/>
+          </w:tcPr>
+          <w:p>
+            <w:r>
+              <w:rPr>
+                <w:b/>
+                <w:color w:val="FFFFFF"/>
+              </w:rPr>
+              <w:t>Production</w:t>
+            </w:r>
+          </w:p>
+        </w:tc>
+        <w:tc>
+          <w:tcPr>
+            <w:tcW w:type="dxa" w:w="2160"/>
+            <w:shd w:fill="1A237E"/>
+          </w:tcPr>
+          <w:p>
+            <w:r>
+              <w:rPr>
+                <w:b/>
+                <w:color w:val="FFFFFF"/>
+              </w:rPr>
+              <w:t>Preview</w:t>
+            </w:r>
+          </w:p>
+        </w:tc>
+        <w:tc>
+          <w:tcPr>
+            <w:tcW w:type="dxa" w:w="2160"/>
+            <w:shd w:fill="1A237E"/>
+          </w:tcPr>
+          <w:p>
+            <w:r>
+              <w:rPr>
+                <w:b/>
+                <w:color w:val="FFFFFF"/>
+              </w:rPr>
+              <w:t>Development</w:t>
+            </w:r>
+          </w:p>
+        </w:tc>
+      </w:tr>
+      <w:tr>
+        <w:tc>
+          <w:tcPr>
+            <w:tcW w:type="dxa" w:w="2160"/>
+          </w:tcPr>
+          <w:p>
+            <w:r>
+              <w:t>VITE_SUPABASE_URL</w:t>
+            </w:r>
+          </w:p>
+        </w:tc>
+        <w:tc>
+          <w:tcPr>
+            <w:tcW w:type="dxa" w:w="2160"/>
+          </w:tcPr>
+          <w:p>
+            <w:r>
+              <w:t>✅ [SENSITIVE]</w:t>
+            </w:r>
+          </w:p>
+        </w:tc>
+        <w:tc>
+          <w:tcPr>
+            <w:tcW w:type="dxa" w:w="2160"/>
+          </w:tcPr>
+          <w:p>
+            <w:r>
+              <w:t>✅ [SENSITIVE]</w:t>
+            </w:r>
+          </w:p>
+        </w:tc>
+        <w:tc>
+          <w:tcPr>
+            <w:tcW w:type="dxa" w:w="2160"/>
+          </w:tcPr>
+          <w:p>
+            <w:r>
+              <w:t>✅</w:t>
+            </w:r>
+          </w:p>
+        </w:tc>
+      </w:tr>
+      <w:tr>
+        <w:tc>
+          <w:tcPr>
+            <w:tcW w:type="dxa" w:w="2160"/>
+            <w:shd w:fill="E8EAF6"/>
+          </w:tcPr>
+          <w:p>
+            <w:r>
+              <w:t>VITE_SUPABASE_ANON_KEY</w:t>
+            </w:r>
+          </w:p>
+        </w:tc>
+        <w:tc>
+          <w:tcPr>
+            <w:tcW w:type="dxa" w:w="2160"/>
+            <w:shd w:fill="E8EAF6"/>
+          </w:tcPr>
+          <w:p>
+            <w:r>
+              <w:t>✅ [SENSITIVE]</w:t>
+            </w:r>
+          </w:p>
+        </w:tc>
+        <w:tc>
+          <w:tcPr>
+            <w:tcW w:type="dxa" w:w="2160"/>
+            <w:shd w:fill="E8EAF6"/>
+          </w:tcPr>
+          <w:p>
+            <w:r>
+              <w:t>✅ [SENSITIVE]</w:t>
+            </w:r>
+          </w:p>
+        </w:tc>
+        <w:tc>
+          <w:tcPr>
+            <w:tcW w:type="dxa" w:w="2160"/>
+            <w:shd w:fill="E8EAF6"/>
+          </w:tcPr>
+          <w:p>
+            <w:r>
+              <w:t>✅</w:t>
+            </w:r>
+          </w:p>
+        </w:tc>
+      </w:tr>
+    </w:tbl>
+    <w:p/>
+    <w:p>
+      <w:r>
+        <w:t>CRON_SECRET and WEBHOOK_SECRET are not used by the web app — Supabase edge functions only.</w:t>
+      </w:r>
+    </w:p>
+    <w:p>
+      <w:pPr>
+        <w:pStyle w:val="Heading2"/>
+      </w:pPr>
+      <w:r>
+        <w:t>9.3 Expo / EAS Environment Variables</w:t>
+      </w:r>
+    </w:p>
+    <w:tbl>
+      <w:tblPr>
+        <w:tblStyle w:val="TableGrid"/>
+        <w:tblW w:type="auto" w:w="0"/>
+        <w:tblLook w:firstColumn="1" w:firstRow="1" w:lastColumn="0" w:lastRow="0" w:noHBand="0" w:noVBand="1" w:val="04A0"/>
+      </w:tblPr>
+      <w:tblGrid>
+        <w:gridCol w:w="2880"/>
+        <w:gridCol w:w="2880"/>
+        <w:gridCol w:w="2880"/>
+      </w:tblGrid>
+      <w:tr>
+        <w:tc>
+          <w:tcPr>
+            <w:tcW w:type="dxa" w:w="2880"/>
+            <w:shd w:fill="1A237E"/>
+          </w:tcPr>
+          <w:p>
+            <w:r>
+              <w:rPr>
+                <w:b/>
+                <w:color w:val="FFFFFF"/>
+              </w:rPr>
+              <w:t>Variable</w:t>
+            </w:r>
+          </w:p>
+        </w:tc>
+        <w:tc>
+          <w:tcPr>
+            <w:tcW w:type="dxa" w:w="2880"/>
+            <w:shd w:fill="1A237E"/>
+          </w:tcPr>
+          <w:p>
+            <w:r>
+              <w:rPr>
+                <w:b/>
+                <w:color w:val="FFFFFF"/>
+              </w:rPr>
+              <w:t>Production</w:t>
+            </w:r>
+          </w:p>
+        </w:tc>
+        <w:tc>
+          <w:tcPr>
+            <w:tcW w:type="dxa" w:w="2880"/>
+            <w:shd w:fill="1A237E"/>
+          </w:tcPr>
+          <w:p>
+            <w:r>
+              <w:rPr>
+                <w:b/>
+                <w:color w:val="FFFFFF"/>
+              </w:rPr>
+              <w:t>Preview</w:t>
+            </w:r>
+          </w:p>
+        </w:tc>
+      </w:tr>
+      <w:tr>
+        <w:tc>
+          <w:tcPr>
+            <w:tcW w:type="dxa" w:w="2880"/>
+          </w:tcPr>
+          <w:p>
+            <w:r>
+              <w:t>EXPO_PUBLIC_SUPABASE_URL</w:t>
+            </w:r>
+          </w:p>
+        </w:tc>
+        <w:tc>
+          <w:tcPr>
+            <w:tcW w:type="dxa" w:w="2880"/>
+          </w:tcPr>
+          <w:p>
+            <w:r>
+              <w:t>✅</w:t>
+            </w:r>
+          </w:p>
+        </w:tc>
+        <w:tc>
+          <w:tcPr>
+            <w:tcW w:type="dxa" w:w="2880"/>
+          </w:tcPr>
+          <w:p>
+            <w:r>
+              <w:t>✅</w:t>
+            </w:r>
+          </w:p>
+        </w:tc>
+      </w:tr>
+      <w:tr>
+        <w:tc>
+          <w:tcPr>
+            <w:tcW w:type="dxa" w:w="2880"/>
+            <w:shd w:fill="E8EAF6"/>
+          </w:tcPr>
+          <w:p>
+            <w:r>
+              <w:t>EXPO_PUBLIC_SUPABASE_ANON_KEY</w:t>
+            </w:r>
+          </w:p>
+        </w:tc>
+        <w:tc>
+          <w:tcPr>
+            <w:tcW w:type="dxa" w:w="2880"/>
+            <w:shd w:fill="E8EAF6"/>
+          </w:tcPr>
+          <w:p>
+            <w:r>
+              <w:t>✅</w:t>
+            </w:r>
+          </w:p>
+        </w:tc>
+        <w:tc>
+          <w:tcPr>
+            <w:tcW w:type="dxa" w:w="2880"/>
+            <w:shd w:fill="E8EAF6"/>
+          </w:tcPr>
+          <w:p>
+            <w:r>
+              <w:t>✅</w:t>
+            </w:r>
+          </w:p>
+        </w:tc>
+      </w:tr>
+    </w:tbl>
+    <w:p/>
+    <w:p>
+      <w:pPr>
+        <w:pStyle w:val="Heading2"/>
+      </w:pPr>
+      <w:r>
+        <w:t>9.4 Generated Secrets</w:t>
+      </w:r>
+    </w:p>
+    <w:p>
+      <w:r>
+        <w:t>CRON_SECRET and WEBHOOK_SECRET were generated on June 20, 2026 using cryptographically secure random bytes (openssl rand -hex 32 equivalent). Values are stored in the Supabase secrets vault only and are NOT recorded in this document.</w:t>
+      </w:r>
+    </w:p>
+    <w:p>
+      <w:pPr>
+        <w:pStyle w:val="Heading2"/>
+      </w:pPr>
+      <w:r>
+        <w:t>9.5 Pending / Still Needed from IT Admin</w:t>
+      </w:r>
+    </w:p>
+    <w:p>
+      <w:pPr>
+        <w:pStyle w:val="ListBullet"/>
+      </w:pPr>
+      <w:r>
+        <w:t>RESEND_API_KEY — required for red-alert, weekly-report, on-inspection-submit emails, supervisor-otp</w:t>
+      </w:r>
+    </w:p>
+    <w:p>
+      <w:pPr>
+        <w:pStyle w:val="ListBullet"/>
+      </w:pPr>
+      <w:r>
+        <w:t>UPSTASH_REDIS_REST_URL + UPSTASH_REDIS_REST_TOKEN — optional rate limiting</w:t>
+      </w:r>
+    </w:p>
+    <w:p>
+      <w:pPr>
+        <w:pStyle w:val="ListBullet"/>
+      </w:pPr>
+      <w:r>
+        <w:t>Recreate Database Webhook on inspections → on-inspection-submit with x-webhook-secret header</w:t>
+      </w:r>
+    </w:p>
+    <w:p>
+      <w:pPr>
+        <w:pStyle w:val="ListBullet"/>
+      </w:pPr>
+      <w:r>
+        <w:t>Migrate inspection-files storage bucket if historical photos are needed</w:t>
+      </w:r>
+    </w:p>
+    <w:p>
+      <w:pPr>
+        <w:pStyle w:val="ListBullet"/>
+      </w:pPr>
+      <w:r>
+        <w:t>Rotate all transfer-session API tokens</w:t>
+      </w:r>
+    </w:p>
+    <w:p>
+      <w:pPr>
+        <w:pStyle w:val="Heading1"/>
+      </w:pPr>
+      <w:r>
+        <w:t>Appendix D — Remaining Manual Steps for IT Admin</w:t>
+      </w:r>
+    </w:p>
+    <w:p>
+      <w:pPr>
+        <w:pStyle w:val="ListNumber"/>
+      </w:pPr>
+      <w:r>
+        <w:t>Provide RESEND_API_KEY and run: supabase secrets set RESEND_API_KEY=re_xxx --project-ref xgwjcknpkpzsbjvuninm</w:t>
+      </w:r>
+    </w:p>
+    <w:p>
+      <w:pPr>
+        <w:pStyle w:val="ListNumber"/>
+      </w:pPr>
+      <w:r>
+        <w:t>Provide Upstash credentials for rate limiting (optional but recommended for production).</w:t>
+      </w:r>
+    </w:p>
+    <w:p>
+      <w:pPr>
+        <w:pStyle w:val="ListNumber"/>
+      </w:pPr>
+      <w:r>
+        <w:t>Recreate Database Webhook on inspections → on-inspection-submit using WEBHOOK_SECRET as x-webhook-secret header.</w:t>
+      </w:r>
+    </w:p>
+    <w:p>
+      <w:pPr>
+        <w:pStyle w:val="ListNumber"/>
+      </w:pPr>
+      <w:r>
+        <w:t>Migrate storage bucket inspection-files using scripts/migrate-storage.py if historical photos are required.</w:t>
+      </w:r>
+    </w:p>
+    <w:p>
+      <w:pPr>
+        <w:pStyle w:val="ListNumber"/>
+      </w:pPr>
+      <w:r>
+        <w:t>Install the new Android APK from EAS build 9e86637f-83fa-4f41-9aa1-10c24890cde2.</w:t>
+      </w:r>
+    </w:p>
+    <w:p>
+      <w:pPr>
+        <w:pStyle w:val="ListNumber"/>
+      </w:pPr>
+      <w:r>
+        <w:t>Rotate every token that was used during this transfer session.</w:t>
+      </w:r>
+    </w:p>
+    <w:p>
+      <w:pPr>
+        <w:pStyle w:val="ListNumber"/>
+      </w:pPr>
+      <w:r>
+        <w:t>Change demo account passwords before distributing credentials to staff.</w:t>
+      </w:r>
+    </w:p>
+    <w:p>
+      <w:pPr>
+        <w:pStyle w:val="Heading1"/>
+      </w:pPr>
+      <w:r>
+        <w:t>Appendix E — All 55 Migrations Applied</w:t>
+      </w:r>
+    </w:p>
+    <w:tbl>
+      <w:tblPr>
+        <w:tblStyle w:val="TableGrid"/>
+        <w:tblW w:type="auto" w:w="0"/>
+        <w:tblLook w:firstColumn="1" w:firstRow="1" w:lastColumn="0" w:lastRow="0" w:noHBand="0" w:noVBand="1" w:val="04A0"/>
+      </w:tblPr>
+      <w:tblGrid>
+        <w:gridCol w:w="4320"/>
+        <w:gridCol w:w="4320"/>
+      </w:tblGrid>
+      <w:tr>
+        <w:tc>
+          <w:tcPr>
+            <w:tcW w:type="dxa" w:w="4320"/>
+            <w:shd w:fill="1A237E"/>
+          </w:tcPr>
+          <w:p>
+            <w:r>
+              <w:rPr>
+                <w:b/>
+                <w:color w:val="FFFFFF"/>
+              </w:rPr>
+              <w:t>#</w:t>
+            </w:r>
+          </w:p>
+        </w:tc>
+        <w:tc>
+          <w:tcPr>
+            <w:tcW w:type="dxa" w:w="4320"/>
+            <w:shd w:fill="1A237E"/>
+          </w:tcPr>
+          <w:p>
+            <w:r>
+              <w:rPr>
+                <w:b/>
+                <w:color w:val="FFFFFF"/>
+              </w:rPr>
+              <w:t>Migration file</w:t>
+            </w:r>
+          </w:p>
+        </w:tc>
+      </w:tr>
+      <w:tr>
+        <w:tc>
+          <w:tcPr>
+            <w:tcW w:type="dxa" w:w="4320"/>
+          </w:tcPr>
+          <w:p>
+            <w:r>
+              <w:t>1</w:t>
+            </w:r>
+          </w:p>
+        </w:tc>
+        <w:tc>
+          <w:tcPr>
+            <w:tcW w:type="dxa" w:w="4320"/>
+          </w:tcPr>
+          <w:p>
+            <w:r>
+              <w:t>20260506000000_phase1_location_gate.sql</w:t>
+            </w:r>
+          </w:p>
+        </w:tc>
+      </w:tr>
+      <w:tr>
+        <w:tc>
+          <w:tcPr>
+            <w:tcW w:type="dxa" w:w="4320"/>
+            <w:shd w:fill="E8EAF6"/>
+          </w:tcPr>
+          <w:p>
+            <w:r>
+              <w:t>2</w:t>
+            </w:r>
+          </w:p>
+        </w:tc>
+        <w:tc>
+          <w:tcPr>
+            <w:tcW w:type="dxa" w:w="4320"/>
+            <w:shd w:fill="E8EAF6"/>
+          </w:tcPr>
+          <w:p>
+            <w:r>
+              <w:t>20260506100100_phase3_location_pings.sql</w:t>
+            </w:r>
+          </w:p>
+        </w:tc>
+      </w:tr>
+      <w:tr>
+        <w:tc>
+          <w:tcPr>
+            <w:tcW w:type="dxa" w:w="4320"/>
+          </w:tcPr>
+          <w:p>
+            <w:r>
+              <w:t>3</w:t>
+            </w:r>
+          </w:p>
+        </w:tc>
+        <w:tc>
+          <w:tcPr>
+            <w:tcW w:type="dxa" w:w="4320"/>
+          </w:tcPr>
+          <w:p>
+            <w:r>
+              <w:t>20260506100200_phase4_batch15_postgis_rpc_functions.sql</w:t>
+            </w:r>
+          </w:p>
+        </w:tc>
+      </w:tr>
+      <w:tr>
+        <w:tc>
+          <w:tcPr>
+            <w:tcW w:type="dxa" w:w="4320"/>
+            <w:shd w:fill="E8EAF6"/>
+          </w:tcPr>
+          <w:p>
+            <w:r>
+              <w:t>4</w:t>
+            </w:r>
+          </w:p>
+        </w:tc>
+        <w:tc>
+          <w:tcPr>
+            <w:tcW w:type="dxa" w:w="4320"/>
+            <w:shd w:fill="E8EAF6"/>
+          </w:tcPr>
+          <w:p>
+            <w:r>
+              <w:t>20260506100300_phase4_postgis_geometry.sql</w:t>
+            </w:r>
+          </w:p>
+        </w:tc>
+      </w:tr>
+      <w:tr>
+        <w:tc>
+          <w:tcPr>
+            <w:tcW w:type="dxa" w:w="4320"/>
+          </w:tcPr>
+          <w:p>
+            <w:r>
+              <w:t>5</w:t>
+            </w:r>
+          </w:p>
+        </w:tc>
+        <w:tc>
+          <w:tcPr>
+            <w:tcW w:type="dxa" w:w="4320"/>
+          </w:tcPr>
+          <w:p>
+            <w:r>
+              <w:t>20260513000000_backend_hardening.sql</w:t>
+            </w:r>
+          </w:p>
+        </w:tc>
+      </w:tr>
+      <w:tr>
+        <w:tc>
+          <w:tcPr>
+            <w:tcW w:type="dxa" w:w="4320"/>
+            <w:shd w:fill="E8EAF6"/>
+          </w:tcPr>
+          <w:p>
+            <w:r>
+              <w:t>6</w:t>
+            </w:r>
+          </w:p>
+        </w:tc>
+        <w:tc>
+          <w:tcPr>
+            <w:tcW w:type="dxa" w:w="4320"/>
+            <w:shd w:fill="E8EAF6"/>
+          </w:tcPr>
+          <w:p>
+            <w:r>
+              <w:t>20260513100100_backend_hardening_followup.sql</w:t>
+            </w:r>
+          </w:p>
+        </w:tc>
+      </w:tr>
+      <w:tr>
+        <w:tc>
+          <w:tcPr>
+            <w:tcW w:type="dxa" w:w="4320"/>
+          </w:tcPr>
+          <w:p>
+            <w:r>
+              <w:t>7</w:t>
+            </w:r>
+          </w:p>
+        </w:tc>
+        <w:tc>
+          <w:tcPr>
+            <w:tcW w:type="dxa" w:w="4320"/>
+          </w:tcPr>
+          <w:p>
+            <w:r>
+              <w:t>20260513100200_risk_classification.sql</w:t>
+            </w:r>
+          </w:p>
+        </w:tc>
+      </w:tr>
+      <w:tr>
+        <w:tc>
+          <w:tcPr>
+            <w:tcW w:type="dxa" w:w="4320"/>
+            <w:shd w:fill="E8EAF6"/>
+          </w:tcPr>
+          <w:p>
+            <w:r>
+              <w:t>8</w:t>
+            </w:r>
+          </w:p>
+        </w:tc>
+        <w:tc>
+          <w:tcPr>
+            <w:tcW w:type="dxa" w:w="4320"/>
+            <w:shd w:fill="E8EAF6"/>
+          </w:tcPr>
+          <w:p>
+            <w:r>
+              <w:t>20260514000000_fix_branches_stores_postgis.sql</w:t>
+            </w:r>
+          </w:p>
+        </w:tc>
+      </w:tr>
+      <w:tr>
+        <w:tc>
+          <w:tcPr>
+            <w:tcW w:type="dxa" w:w="4320"/>
+          </w:tcPr>
+          <w:p>
+            <w:r>
+              <w:t>9</w:t>
+            </w:r>
+          </w:p>
+        </w:tc>
+        <w:tc>
+          <w:tcPr>
+            <w:tcW w:type="dxa" w:w="4320"/>
+          </w:tcPr>
+          <w:p>
+            <w:r>
+              <w:t>20260514100100_stores_compat_and_rls.sql</w:t>
+            </w:r>
+          </w:p>
+        </w:tc>
+      </w:tr>
+      <w:tr>
+        <w:tc>
+          <w:tcPr>
+            <w:tcW w:type="dxa" w:w="4320"/>
+            <w:shd w:fill="E8EAF6"/>
+          </w:tcPr>
+          <w:p>
+            <w:r>
+              <w:t>10</w:t>
+            </w:r>
+          </w:p>
+        </w:tc>
+        <w:tc>
+          <w:tcPr>
+            <w:tcW w:type="dxa" w:w="4320"/>
+            <w:shd w:fill="E8EAF6"/>
+          </w:tcPr>
+          <w:p>
+            <w:r>
+              <w:t>20260519000000_checklist_scoring_item_files.sql</w:t>
+            </w:r>
+          </w:p>
+        </w:tc>
+      </w:tr>
+      <w:tr>
+        <w:tc>
+          <w:tcPr>
+            <w:tcW w:type="dxa" w:w="4320"/>
+          </w:tcPr>
+          <w:p>
+            <w:r>
+              <w:t>11</w:t>
+            </w:r>
+          </w:p>
+        </w:tc>
+        <w:tc>
+          <w:tcPr>
+            <w:tcW w:type="dxa" w:w="4320"/>
+          </w:tcPr>
+          <w:p>
+            <w:r>
+              <w:t>20260520000000_audit_role.sql</w:t>
+            </w:r>
+          </w:p>
+        </w:tc>
+      </w:tr>
+      <w:tr>
+        <w:tc>
+          <w:tcPr>
+            <w:tcW w:type="dxa" w:w="4320"/>
+            <w:shd w:fill="E8EAF6"/>
+          </w:tcPr>
+          <w:p>
+            <w:r>
+              <w:t>12</w:t>
+            </w:r>
+          </w:p>
+        </w:tc>
+        <w:tc>
+          <w:tcPr>
+            <w:tcW w:type="dxa" w:w="4320"/>
+            <w:shd w:fill="E8EAF6"/>
+          </w:tcPr>
+          <w:p>
+            <w:r>
+              <w:t>20260520100100_refill_inspection.sql</w:t>
+            </w:r>
+          </w:p>
+        </w:tc>
+      </w:tr>
+      <w:tr>
+        <w:tc>
+          <w:tcPr>
+            <w:tcW w:type="dxa" w:w="4320"/>
+          </w:tcPr>
+          <w:p>
+            <w:r>
+              <w:t>13</w:t>
+            </w:r>
+          </w:p>
+        </w:tc>
+        <w:tc>
+          <w:tcPr>
+            <w:tcW w:type="dxa" w:w="4320"/>
+          </w:tcPr>
+          <w:p>
+            <w:r>
+              <w:t>20260520100200_risk_tables_and_seed.sql</w:t>
+            </w:r>
+          </w:p>
+        </w:tc>
+      </w:tr>
+      <w:tr>
+        <w:tc>
+          <w:tcPr>
+            <w:tcW w:type="dxa" w:w="4320"/>
+            <w:shd w:fill="E8EAF6"/>
+          </w:tcPr>
+          <w:p>
+            <w:r>
+              <w:t>14</w:t>
+            </w:r>
+          </w:p>
+        </w:tc>
+        <w:tc>
+          <w:tcPr>
+            <w:tcW w:type="dxa" w:w="4320"/>
+            <w:shd w:fill="E8EAF6"/>
+          </w:tcPr>
+          <w:p>
+            <w:r>
+              <w:t>20260521000000_audit_user_roles_own_row.sql</w:t>
+            </w:r>
+          </w:p>
+        </w:tc>
+      </w:tr>
+      <w:tr>
+        <w:tc>
+          <w:tcPr>
+            <w:tcW w:type="dxa" w:w="4320"/>
+          </w:tcPr>
+          <w:p>
+            <w:r>
+              <w:t>15</w:t>
+            </w:r>
+          </w:p>
+        </w:tc>
+        <w:tc>
+          <w:tcPr>
+            <w:tcW w:type="dxa" w:w="4320"/>
+          </w:tcPr>
+          <w:p>
+            <w:r>
+              <w:t>20260521100100_branch_daily_locks.sql</w:t>
+            </w:r>
+          </w:p>
+        </w:tc>
+      </w:tr>
+      <w:tr>
+        <w:tc>
+          <w:tcPr>
+            <w:tcW w:type="dxa" w:w="4320"/>
+            <w:shd w:fill="E8EAF6"/>
+          </w:tcPr>
+          <w:p>
+            <w:r>
+              <w:t>16</w:t>
+            </w:r>
+          </w:p>
+        </w:tc>
+        <w:tc>
+          <w:tcPr>
+            <w:tcW w:type="dxa" w:w="4320"/>
+            <w:shd w:fill="E8EAF6"/>
+          </w:tcPr>
+          <w:p>
+            <w:r>
+              <w:t>20260521100200_officer_submit_rls_fix.sql</w:t>
+            </w:r>
+          </w:p>
+        </w:tc>
+      </w:tr>
+      <w:tr>
+        <w:tc>
+          <w:tcPr>
+            <w:tcW w:type="dxa" w:w="4320"/>
+          </w:tcPr>
+          <w:p>
+            <w:r>
+              <w:t>17</w:t>
+            </w:r>
+          </w:p>
+        </w:tc>
+        <w:tc>
+          <w:tcPr>
+            <w:tcW w:type="dxa" w:w="4320"/>
+          </w:tcPr>
+          <w:p>
+            <w:r>
+              <w:t>20260522000000_get_my_user_role_rpc.sql</w:t>
+            </w:r>
+          </w:p>
+        </w:tc>
+      </w:tr>
+      <w:tr>
+        <w:tc>
+          <w:tcPr>
+            <w:tcW w:type="dxa" w:w="4320"/>
+            <w:shd w:fill="E8EAF6"/>
+          </w:tcPr>
+          <w:p>
+            <w:r>
+              <w:t>18</w:t>
+            </w:r>
+          </w:p>
+        </w:tc>
+        <w:tc>
+          <w:tcPr>
+            <w:tcW w:type="dxa" w:w="4320"/>
+            <w:shd w:fill="E8EAF6"/>
+          </w:tcPr>
+          <w:p>
+            <w:r>
+              <w:t>20260522100100_management_submitted_read.sql</w:t>
+            </w:r>
+          </w:p>
+        </w:tc>
+      </w:tr>
+      <w:tr>
+        <w:tc>
+          <w:tcPr>
+            <w:tcW w:type="dxa" w:w="4320"/>
+          </w:tcPr>
+          <w:p>
+            <w:r>
+              <w:t>19</w:t>
+            </w:r>
+          </w:p>
+        </w:tc>
+        <w:tc>
+          <w:tcPr>
+            <w:tcW w:type="dxa" w:w="4320"/>
+          </w:tcPr>
+          <w:p>
+            <w:r>
+              <w:t>20260529000000_management_dashboard_indexes.sql</w:t>
+            </w:r>
+          </w:p>
+        </w:tc>
+      </w:tr>
+      <w:tr>
+        <w:tc>
+          <w:tcPr>
+            <w:tcW w:type="dxa" w:w="4320"/>
+            <w:shd w:fill="E8EAF6"/>
+          </w:tcPr>
+          <w:p>
+            <w:r>
+              <w:t>20</w:t>
+            </w:r>
+          </w:p>
+        </w:tc>
+        <w:tc>
+          <w:tcPr>
+            <w:tcW w:type="dxa" w:w="4320"/>
+            <w:shd w:fill="E8EAF6"/>
+          </w:tcPr>
+          <w:p>
+            <w:r>
+              <w:t>20260530000000_account_requests.sql</w:t>
+            </w:r>
+          </w:p>
+        </w:tc>
+      </w:tr>
+      <w:tr>
+        <w:tc>
+          <w:tcPr>
+            <w:tcW w:type="dxa" w:w="4320"/>
+          </w:tcPr>
+          <w:p>
+            <w:r>
+              <w:t>21</w:t>
+            </w:r>
+          </w:p>
+        </w:tc>
+        <w:tc>
+          <w:tcPr>
+            <w:tcW w:type="dxa" w:w="4320"/>
+          </w:tcPr>
+          <w:p>
+            <w:r>
+              <w:t>20260530100100_canonical_vigilance_accounts.sql</w:t>
+            </w:r>
+          </w:p>
+        </w:tc>
+      </w:tr>
+      <w:tr>
+        <w:tc>
+          <w:tcPr>
+            <w:tcW w:type="dxa" w:w="4320"/>
+            <w:shd w:fill="E8EAF6"/>
+          </w:tcPr>
+          <w:p>
+            <w:r>
+              <w:t>22</w:t>
+            </w:r>
+          </w:p>
+        </w:tc>
+        <w:tc>
+          <w:tcPr>
+            <w:tcW w:type="dxa" w:w="4320"/>
+            <w:shd w:fill="E8EAF6"/>
+          </w:tcPr>
+          <w:p>
+            <w:r>
+              <w:t>20260530100200_supra_policy_acceptance.sql</w:t>
+            </w:r>
+          </w:p>
+        </w:tc>
+      </w:tr>
+      <w:tr>
+        <w:tc>
+          <w:tcPr>
+            <w:tcW w:type="dxa" w:w="4320"/>
+          </w:tcPr>
+          <w:p>
+            <w:r>
+              <w:t>23</w:t>
+            </w:r>
+          </w:p>
+        </w:tc>
+        <w:tc>
+          <w:tcPr>
+            <w:tcW w:type="dxa" w:w="4320"/>
+          </w:tcPr>
+          <w:p>
+            <w:r>
+              <w:t>20260606000000_fix_inspection_responses_check_constraint.sql</w:t>
+            </w:r>
+          </w:p>
+        </w:tc>
+      </w:tr>
+      <w:tr>
+        <w:tc>
+          <w:tcPr>
+            <w:tcW w:type="dxa" w:w="4320"/>
+            <w:shd w:fill="E8EAF6"/>
+          </w:tcPr>
+          <w:p>
+            <w:r>
+              <w:t>24</w:t>
+            </w:r>
+          </w:p>
+        </w:tc>
+        <w:tc>
+          <w:tcPr>
+            <w:tcW w:type="dxa" w:w="4320"/>
+            <w:shd w:fill="E8EAF6"/>
+          </w:tcPr>
+          <w:p>
+            <w:r>
+              <w:t>20260606100100_fix_submitted_inspection_times.sql</w:t>
+            </w:r>
+          </w:p>
+        </w:tc>
+      </w:tr>
+      <w:tr>
+        <w:tc>
+          <w:tcPr>
+            <w:tcW w:type="dxa" w:w="4320"/>
+          </w:tcPr>
+          <w:p>
+            <w:r>
+              <w:t>25</w:t>
+            </w:r>
+          </w:p>
+        </w:tc>
+        <w:tc>
+          <w:tcPr>
+            <w:tcW w:type="dxa" w:w="4320"/>
+          </w:tcPr>
+          <w:p>
+            <w:r>
+              <w:t>20260606100200_storage_policy_inspection_files.sql</w:t>
+            </w:r>
+          </w:p>
+        </w:tc>
+      </w:tr>
+      <w:tr>
+        <w:tc>
+          <w:tcPr>
+            <w:tcW w:type="dxa" w:w="4320"/>
+            <w:shd w:fill="E8EAF6"/>
+          </w:tcPr>
+          <w:p>
+            <w:r>
+              <w:t>26</w:t>
+            </w:r>
+          </w:p>
+        </w:tc>
+        <w:tc>
+          <w:tcPr>
+            <w:tcW w:type="dxa" w:w="4320"/>
+            <w:shd w:fill="E8EAF6"/>
+          </w:tcPr>
+          <w:p>
+            <w:r>
+              <w:t>20260607000000_fix_claim_branch_timein.sql</w:t>
+            </w:r>
+          </w:p>
+        </w:tc>
+      </w:tr>
+      <w:tr>
+        <w:tc>
+          <w:tcPr>
+            <w:tcW w:type="dxa" w:w="4320"/>
+          </w:tcPr>
+          <w:p>
+            <w:r>
+              <w:t>27</w:t>
+            </w:r>
+          </w:p>
+        </w:tc>
+        <w:tc>
+          <w:tcPr>
+            <w:tcW w:type="dxa" w:w="4320"/>
+          </w:tcPr>
+          <w:p>
+            <w:r>
+              <w:t>20260607100100_fix_storage_select_policy.sql</w:t>
+            </w:r>
+          </w:p>
+        </w:tc>
+      </w:tr>
+      <w:tr>
+        <w:tc>
+          <w:tcPr>
+            <w:tcW w:type="dxa" w:w="4320"/>
+            <w:shd w:fill="E8EAF6"/>
+          </w:tcPr>
+          <w:p>
+            <w:r>
+              <w:t>28</w:t>
+            </w:r>
+          </w:p>
+        </w:tc>
+        <w:tc>
+          <w:tcPr>
+            <w:tcW w:type="dxa" w:w="4320"/>
+            <w:shd w:fill="E8EAF6"/>
+          </w:tcPr>
+          <w:p>
+            <w:r>
+              <w:t>20260611000000_district_officer_assignments.sql</w:t>
+            </w:r>
+          </w:p>
+        </w:tc>
+      </w:tr>
+      <w:tr>
+        <w:tc>
+          <w:tcPr>
+            <w:tcW w:type="dxa" w:w="4320"/>
+          </w:tcPr>
+          <w:p>
+            <w:r>
+              <w:t>29</w:t>
+            </w:r>
+          </w:p>
+        </w:tc>
+        <w:tc>
+          <w:tcPr>
+            <w:tcW w:type="dxa" w:w="4320"/>
+          </w:tcPr>
+          <w:p>
+            <w:r>
+              <w:t>20260611100100_officer_district_stores_rls.sql</w:t>
+            </w:r>
+          </w:p>
+        </w:tc>
+      </w:tr>
+      <w:tr>
+        <w:tc>
+          <w:tcPr>
+            <w:tcW w:type="dxa" w:w="4320"/>
+            <w:shd w:fill="E8EAF6"/>
+          </w:tcPr>
+          <w:p>
+            <w:r>
+              <w:t>30</w:t>
+            </w:r>
+          </w:p>
+        </w:tc>
+        <w:tc>
+          <w:tcPr>
+            <w:tcW w:type="dxa" w:w="4320"/>
+            <w:shd w:fill="E8EAF6"/>
+          </w:tcPr>
+          <w:p>
+            <w:r>
+              <w:t>20260611100200_stores_region_district.sql</w:t>
+            </w:r>
+          </w:p>
+        </w:tc>
+      </w:tr>
+      <w:tr>
+        <w:tc>
+          <w:tcPr>
+            <w:tcW w:type="dxa" w:w="4320"/>
+          </w:tcPr>
+          <w:p>
+            <w:r>
+              <w:t>31</w:t>
+            </w:r>
+          </w:p>
+        </w:tc>
+        <w:tc>
+          <w:tcPr>
+            <w:tcW w:type="dxa" w:w="4320"/>
+          </w:tcPr>
+          <w:p>
+            <w:r>
+              <w:t>20260612000000_add_video_support.sql</w:t>
+            </w:r>
+          </w:p>
+        </w:tc>
+      </w:tr>
+      <w:tr>
+        <w:tc>
+          <w:tcPr>
+            <w:tcW w:type="dxa" w:w="4320"/>
+            <w:shd w:fill="E8EAF6"/>
+          </w:tcPr>
+          <w:p>
+            <w:r>
+              <w:t>32</w:t>
+            </w:r>
+          </w:p>
+        </w:tc>
+        <w:tc>
+          <w:tcPr>
+            <w:tcW w:type="dxa" w:w="4320"/>
+            <w:shd w:fill="E8EAF6"/>
+          </w:tcPr>
+          <w:p>
+            <w:r>
+              <w:t>20260612100100_audit_role_rls.sql</w:t>
+            </w:r>
+          </w:p>
+        </w:tc>
+      </w:tr>
+      <w:tr>
+        <w:tc>
+          <w:tcPr>
+            <w:tcW w:type="dxa" w:w="4320"/>
+          </w:tcPr>
+          <w:p>
+            <w:r>
+              <w:t>33</w:t>
+            </w:r>
+          </w:p>
+        </w:tc>
+        <w:tc>
+          <w:tcPr>
+            <w:tcW w:type="dxa" w:w="4320"/>
+          </w:tcPr>
+          <w:p>
+            <w:r>
+              <w:t>20260612100200_canonical_store_districts.sql</w:t>
+            </w:r>
+          </w:p>
+        </w:tc>
+      </w:tr>
+      <w:tr>
+        <w:tc>
+          <w:tcPr>
+            <w:tcW w:type="dxa" w:w="4320"/>
+            <w:shd w:fill="E8EAF6"/>
+          </w:tcPr>
+          <w:p>
+            <w:r>
+              <w:t>34</w:t>
+            </w:r>
+          </w:p>
+        </w:tc>
+        <w:tc>
+          <w:tcPr>
+            <w:tcW w:type="dxa" w:w="4320"/>
+            <w:shd w:fill="E8EAF6"/>
+          </w:tcPr>
+          <w:p>
+            <w:r>
+              <w:t>20260612100300_checklist_item_options.sql</w:t>
+            </w:r>
+          </w:p>
+        </w:tc>
+      </w:tr>
+      <w:tr>
+        <w:tc>
+          <w:tcPr>
+            <w:tcW w:type="dxa" w:w="4320"/>
+          </w:tcPr>
+          <w:p>
+            <w:r>
+              <w:t>35</w:t>
+            </w:r>
+          </w:p>
+        </w:tc>
+        <w:tc>
+          <w:tcPr>
+            <w:tcW w:type="dxa" w:w="4320"/>
+          </w:tcPr>
+          <w:p>
+            <w:r>
+              <w:t>20260612100400_district_scoped_branches_rls.sql</w:t>
+            </w:r>
+          </w:p>
+        </w:tc>
+      </w:tr>
+      <w:tr>
+        <w:tc>
+          <w:tcPr>
+            <w:tcW w:type="dxa" w:w="4320"/>
+            <w:shd w:fill="E8EAF6"/>
+          </w:tcPr>
+          <w:p>
+            <w:r>
+              <w:t>36</w:t>
+            </w:r>
+          </w:p>
+        </w:tc>
+        <w:tc>
+          <w:tcPr>
+            <w:tcW w:type="dxa" w:w="4320"/>
+            <w:shd w:fill="E8EAF6"/>
+          </w:tcPr>
+          <w:p>
+            <w:r>
+              <w:t>20260612100500_fix_branch_locks_rpc.sql</w:t>
+            </w:r>
+          </w:p>
+        </w:tc>
+      </w:tr>
+      <w:tr>
+        <w:tc>
+          <w:tcPr>
+            <w:tcW w:type="dxa" w:w="4320"/>
+          </w:tcPr>
+          <w:p>
+            <w:r>
+              <w:t>37</w:t>
+            </w:r>
+          </w:p>
+        </w:tc>
+        <w:tc>
+          <w:tcPr>
+            <w:tcW w:type="dxa" w:w="4320"/>
+          </w:tcPr>
+          <w:p>
+            <w:r>
+              <w:t>20260612100600_fix_inspection_media_storage_access.sql</w:t>
+            </w:r>
+          </w:p>
+        </w:tc>
+      </w:tr>
+      <w:tr>
+        <w:tc>
+          <w:tcPr>
+            <w:tcW w:type="dxa" w:w="4320"/>
+            <w:shd w:fill="E8EAF6"/>
+          </w:tcPr>
+          <w:p>
+            <w:r>
+              <w:t>38</w:t>
+            </w:r>
+          </w:p>
+        </w:tc>
+        <w:tc>
+          <w:tcPr>
+            <w:tcW w:type="dxa" w:w="4320"/>
+            <w:shd w:fill="E8EAF6"/>
+          </w:tcPr>
+          <w:p>
+            <w:r>
+              <w:t>20260612100700_fix_inspection_storage_upload_policies.sql</w:t>
+            </w:r>
+          </w:p>
+        </w:tc>
+      </w:tr>
+      <w:tr>
+        <w:tc>
+          <w:tcPr>
+            <w:tcW w:type="dxa" w:w="4320"/>
+          </w:tcPr>
+          <w:p>
+            <w:r>
+              <w:t>39</w:t>
+            </w:r>
+          </w:p>
+        </w:tc>
+        <w:tc>
+          <w:tcPr>
+            <w:tcW w:type="dxa" w:w="4320"/>
+          </w:tcPr>
+          <w:p>
+            <w:r>
+              <w:t>20260612100800_officer_inspection_media_upload.sql</w:t>
+            </w:r>
+          </w:p>
+        </w:tc>
+      </w:tr>
+      <w:tr>
+        <w:tc>
+          <w:tcPr>
+            <w:tcW w:type="dxa" w:w="4320"/>
+            <w:shd w:fill="E8EAF6"/>
+          </w:tcPr>
+          <w:p>
+            <w:r>
+              <w:t>40</w:t>
+            </w:r>
+          </w:p>
+        </w:tc>
+        <w:tc>
+          <w:tcPr>
+            <w:tcW w:type="dxa" w:w="4320"/>
+            <w:shd w:fill="E8EAF6"/>
+          </w:tcPr>
+          <w:p>
+            <w:r>
+              <w:t>20260612100900_secure_storage_bucket.sql</w:t>
+            </w:r>
+          </w:p>
+        </w:tc>
+      </w:tr>
+      <w:tr>
+        <w:tc>
+          <w:tcPr>
+            <w:tcW w:type="dxa" w:w="4320"/>
+          </w:tcPr>
+          <w:p>
+            <w:r>
+              <w:t>41</w:t>
+            </w:r>
+          </w:p>
+        </w:tc>
+        <w:tc>
+          <w:tcPr>
+            <w:tcW w:type="dxa" w:w="4320"/>
+          </w:tcPr>
+          <w:p>
+            <w:r>
+              <w:t>20260613100100_branch_assignment_rls.sql</w:t>
+            </w:r>
+          </w:p>
+        </w:tc>
+      </w:tr>
+      <w:tr>
+        <w:tc>
+          <w:tcPr>
+            <w:tcW w:type="dxa" w:w="4320"/>
+            <w:shd w:fill="E8EAF6"/>
+          </w:tcPr>
+          <w:p>
+            <w:r>
+              <w:t>42</w:t>
+            </w:r>
+          </w:p>
+        </w:tc>
+        <w:tc>
+          <w:tcPr>
+            <w:tcW w:type="dxa" w:w="4320"/>
+            <w:shd w:fill="E8EAF6"/>
+          </w:tcPr>
+          <w:p>
+            <w:r>
+              <w:t>20260613100200_officer_leave_log.sql</w:t>
+            </w:r>
+          </w:p>
+        </w:tc>
+      </w:tr>
+      <w:tr>
+        <w:tc>
+          <w:tcPr>
+            <w:tcW w:type="dxa" w:w="4320"/>
+          </w:tcPr>
+          <w:p>
+            <w:r>
+              <w:t>43</w:t>
+            </w:r>
+          </w:p>
+        </w:tc>
+        <w:tc>
+          <w:tcPr>
+            <w:tcW w:type="dxa" w:w="4320"/>
+          </w:tcPr>
+          <w:p>
+            <w:r>
+              <w:t>20260613100300_risk_resolution_fields.sql</w:t>
+            </w:r>
+          </w:p>
+        </w:tc>
+      </w:tr>
+      <w:tr>
+        <w:tc>
+          <w:tcPr>
+            <w:tcW w:type="dxa" w:w="4320"/>
+            <w:shd w:fill="E8EAF6"/>
+          </w:tcPr>
+          <w:p>
+            <w:r>
+              <w:t>44</w:t>
+            </w:r>
+          </w:p>
+        </w:tc>
+        <w:tc>
+          <w:tcPr>
+            <w:tcW w:type="dxa" w:w="4320"/>
+            <w:shd w:fill="E8EAF6"/>
+          </w:tcPr>
+          <w:p>
+            <w:r>
+              <w:t>20260613100400_store_officer_assignment.sql</w:t>
+            </w:r>
+          </w:p>
+        </w:tc>
+      </w:tr>
+      <w:tr>
+        <w:tc>
+          <w:tcPr>
+            <w:tcW w:type="dxa" w:w="4320"/>
+          </w:tcPr>
+          <w:p>
+            <w:r>
+              <w:t>45</w:t>
+            </w:r>
+          </w:p>
+        </w:tc>
+        <w:tc>
+          <w:tcPr>
+            <w:tcW w:type="dxa" w:w="4320"/>
+          </w:tcPr>
+          <w:p>
+            <w:r>
+              <w:t>20260613100500_video_storage_notes.sql</w:t>
+            </w:r>
+          </w:p>
+        </w:tc>
+      </w:tr>
+      <w:tr>
+        <w:tc>
+          <w:tcPr>
+            <w:tcW w:type="dxa" w:w="4320"/>
+            <w:shd w:fill="E8EAF6"/>
+          </w:tcPr>
+          <w:p>
+            <w:r>
+              <w:t>46</w:t>
+            </w:r>
+          </w:p>
+        </w:tc>
+        <w:tc>
+          <w:tcPr>
+            <w:tcW w:type="dxa" w:w="4320"/>
+            <w:shd w:fill="E8EAF6"/>
+          </w:tcPr>
+          <w:p>
+            <w:r>
+              <w:t>20260613143001_security_rpc_caller_checks.sql</w:t>
+            </w:r>
+          </w:p>
+        </w:tc>
+      </w:tr>
+      <w:tr>
+        <w:tc>
+          <w:tcPr>
+            <w:tcW w:type="dxa" w:w="4320"/>
+          </w:tcPr>
+          <w:p>
+            <w:r>
+              <w:t>47</w:t>
+            </w:r>
+          </w:p>
+        </w:tc>
+        <w:tc>
+          <w:tcPr>
+            <w:tcW w:type="dxa" w:w="4320"/>
+          </w:tcPr>
+          <w:p>
+            <w:r>
+              <w:t>20260613143002_security_officer_districts_scope.sql</w:t>
+            </w:r>
+          </w:p>
+        </w:tc>
+      </w:tr>
+      <w:tr>
+        <w:tc>
+          <w:tcPr>
+            <w:tcW w:type="dxa" w:w="4320"/>
+            <w:shd w:fill="E8EAF6"/>
+          </w:tcPr>
+          <w:p>
+            <w:r>
+              <w:t>48</w:t>
+            </w:r>
+          </w:p>
+        </w:tc>
+        <w:tc>
+          <w:tcPr>
+            <w:tcW w:type="dxa" w:w="4320"/>
+            <w:shd w:fill="E8EAF6"/>
+          </w:tcPr>
+          <w:p>
+            <w:r>
+              <w:t>20260613143003_security_fix_audit_rls.sql</w:t>
+            </w:r>
+          </w:p>
+        </w:tc>
+      </w:tr>
+      <w:tr>
+        <w:tc>
+          <w:tcPr>
+            <w:tcW w:type="dxa" w:w="4320"/>
+          </w:tcPr>
+          <w:p>
+            <w:r>
+              <w:t>49</w:t>
+            </w:r>
+          </w:p>
+        </w:tc>
+        <w:tc>
+          <w:tcPr>
+            <w:tcW w:type="dxa" w:w="4320"/>
+          </w:tcPr>
+          <w:p>
+            <w:r>
+              <w:t>20260613150000_restore_demo_account_passwords.sql</w:t>
+            </w:r>
+          </w:p>
+        </w:tc>
+      </w:tr>
+      <w:tr>
+        <w:tc>
+          <w:tcPr>
+            <w:tcW w:type="dxa" w:w="4320"/>
+            <w:shd w:fill="E8EAF6"/>
+          </w:tcPr>
+          <w:p>
+            <w:r>
+              <w:t>50</w:t>
+            </w:r>
+          </w:p>
+        </w:tc>
+        <w:tc>
+          <w:tcPr>
+            <w:tcW w:type="dxa" w:w="4320"/>
+            <w:shd w:fill="E8EAF6"/>
+          </w:tcPr>
+          <w:p>
+            <w:r>
+              <w:t>20260613200000_remove_head_role.sql</w:t>
+            </w:r>
+          </w:p>
+        </w:tc>
+      </w:tr>
+      <w:tr>
+        <w:tc>
+          <w:tcPr>
+            <w:tcW w:type="dxa" w:w="4320"/>
+          </w:tcPr>
+          <w:p>
+            <w:r>
+              <w:t>51</w:t>
+            </w:r>
+          </w:p>
+        </w:tc>
+        <w:tc>
+          <w:tcPr>
+            <w:tcW w:type="dxa" w:w="4320"/>
+          </w:tcPr>
+          <w:p>
+            <w:r>
+              <w:t>20260614000000_edit_window_and_multi_reports.sql</w:t>
+            </w:r>
+          </w:p>
+        </w:tc>
+      </w:tr>
+      <w:tr>
+        <w:tc>
+          <w:tcPr>
+            <w:tcW w:type="dxa" w:w="4320"/>
+            <w:shd w:fill="E8EAF6"/>
+          </w:tcPr>
+          <w:p>
+            <w:r>
+              <w:t>52</w:t>
+            </w:r>
+          </w:p>
+        </w:tc>
+        <w:tc>
+          <w:tcPr>
+            <w:tcW w:type="dxa" w:w="4320"/>
+            <w:shd w:fill="E8EAF6"/>
+          </w:tcPr>
+          <w:p>
+            <w:r>
+              <w:t>20260614085144_add_geofence_location_status.sql</w:t>
+            </w:r>
+          </w:p>
+        </w:tc>
+      </w:tr>
+      <w:tr>
+        <w:tc>
+          <w:tcPr>
+            <w:tcW w:type="dxa" w:w="4320"/>
+          </w:tcPr>
+          <w:p>
+            <w:r>
+              <w:t>53</w:t>
+            </w:r>
+          </w:p>
+        </w:tc>
+        <w:tc>
+          <w:tcPr>
+            <w:tcW w:type="dxa" w:w="4320"/>
+          </w:tcPr>
+          <w:p>
+            <w:r>
+              <w:t>20260615000000_fix_claim_branch_overload.sql</w:t>
+            </w:r>
+          </w:p>
+        </w:tc>
+      </w:tr>
+      <w:tr>
+        <w:tc>
+          <w:tcPr>
+            <w:tcW w:type="dxa" w:w="4320"/>
+            <w:shd w:fill="E8EAF6"/>
+          </w:tcPr>
+          <w:p>
+            <w:r>
+              <w:t>54</w:t>
+            </w:r>
+          </w:p>
+        </w:tc>
+        <w:tc>
+          <w:tcPr>
+            <w:tcW w:type="dxa" w:w="4320"/>
+            <w:shd w:fill="E8EAF6"/>
+          </w:tcPr>
+          <w:p>
+            <w:r>
+              <w:t>20260616000000_fix_checklist_store_type_name.sql</w:t>
+            </w:r>
+          </w:p>
+        </w:tc>
+      </w:tr>
+      <w:tr>
+        <w:tc>
+          <w:tcPr>
+            <w:tcW w:type="dxa" w:w="4320"/>
+          </w:tcPr>
+          <w:p>
+            <w:r>
+              <w:t>55</w:t>
+            </w:r>
+          </w:p>
+        </w:tc>
+        <w:tc>
+          <w:tcPr>
+            <w:tcW w:type="dxa" w:w="4320"/>
+          </w:tcPr>
+          <w:p>
+            <w:r>
+              <w:t>20260616100100_migrate_common_checklist_to_store.sql</w:t>
+            </w:r>
+          </w:p>
+        </w:tc>
+      </w:tr>
+    </w:tbl>
+    <w:p/>
+    <w:p>
+      <w:pPr>
+        <w:pStyle w:val="Heading1"/>
+      </w:pPr>
+      <w:r>
+        <w:t>Section 10 — Post-Transfer DB &amp; App Health Verification</w:t>
+      </w:r>
+    </w:p>
+    <w:p>
+      <w:r>
+        <w:t>Verification date: June 20, 2026</w:t>
+      </w:r>
+    </w:p>
+    <w:p>
+      <w:pPr>
+        <w:pStyle w:val="Heading2"/>
+      </w:pPr>
+      <w:r>
+        <w:t>10.1 Migrations</w:t>
+      </w:r>
+    </w:p>
+    <w:p>
+      <w:r>
+        <w:t>Local migration files: 55. Database schema_migrations records: 55. Zero local-only or DB-only entries — full match.</w:t>
+      </w:r>
+    </w:p>
+    <w:p>
+      <w:pPr>
+        <w:pStyle w:val="Heading2"/>
+      </w:pPr>
+      <w:r>
+        <w:t>10.2 Schema Drift</w:t>
+      </w:r>
+    </w:p>
+    <w:p>
+      <w:r>
+        <w:t>TypeScript types regenerated from live DB (project xgwjcknpkpzsbjvuninm) and synced to web/src/types/supabase.ts and mobile/types/supabase.ts. Removed stale PostGIS view/function noise from old project types; app RPCs (was_officer_in_range, compute_inspection_location_status, etc.) now match live schema.</w:t>
+      </w:r>
+    </w:p>
+    <w:p>
+      <w:r>
+        <w:t>Manual fix applied: was_officer_in_range and compute_inspection_location_status search_path set to public, extensions (PostGIS geometry type resolution).</w:t>
+      </w:r>
+    </w:p>
+    <w:p>
+      <w:pPr>
+        <w:pStyle w:val="Heading2"/>
+      </w:pPr>
+      <w:r>
+        <w:t>10.3 RLS Policies &amp; Triggers</w:t>
+      </w:r>
+    </w:p>
+    <w:tbl>
+      <w:tblPr>
+        <w:tblStyle w:val="TableGrid"/>
+        <w:tblW w:type="auto" w:w="0"/>
+        <w:tblLook w:firstColumn="1" w:firstRow="1" w:lastColumn="0" w:lastRow="0" w:noHBand="0" w:noVBand="1" w:val="04A0"/>
+      </w:tblPr>
+      <w:tblGrid>
+        <w:gridCol w:w="2160"/>
+        <w:gridCol w:w="2160"/>
+        <w:gridCol w:w="2160"/>
+        <w:gridCol w:w="2160"/>
+      </w:tblGrid>
+      <w:tr>
+        <w:tc>
+          <w:tcPr>
+            <w:tcW w:type="dxa" w:w="2160"/>
+            <w:shd w:fill="1A237E"/>
+          </w:tcPr>
+          <w:p>
+            <w:r>
+              <w:rPr>
+                <w:b/>
+                <w:color w:val="FFFFFF"/>
+              </w:rPr>
+              <w:t>Check</w:t>
+            </w:r>
+          </w:p>
+        </w:tc>
+        <w:tc>
+          <w:tcPr>
+            <w:tcW w:type="dxa" w:w="2160"/>
+            <w:shd w:fill="1A237E"/>
+          </w:tcPr>
+          <w:p>
+            <w:r>
+              <w:rPr>
+                <w:b/>
+                <w:color w:val="FFFFFF"/>
+              </w:rPr>
+              <w:t>Expected</w:t>
+            </w:r>
+          </w:p>
+        </w:tc>
+        <w:tc>
+          <w:tcPr>
+            <w:tcW w:type="dxa" w:w="2160"/>
+            <w:shd w:fill="1A237E"/>
+          </w:tcPr>
+          <w:p>
+            <w:r>
+              <w:rPr>
+                <w:b/>
+                <w:color w:val="FFFFFF"/>
+              </w:rPr>
+              <w:t>Actual</w:t>
+            </w:r>
+          </w:p>
+        </w:tc>
+        <w:tc>
+          <w:tcPr>
+            <w:tcW w:type="dxa" w:w="2160"/>
+            <w:shd w:fill="1A237E"/>
+          </w:tcPr>
+          <w:p>
+            <w:r>
+              <w:rPr>
+                <w:b/>
+                <w:color w:val="FFFFFF"/>
+              </w:rPr>
+              <w:t>Status</w:t>
+            </w:r>
+          </w:p>
+        </w:tc>
+      </w:tr>
+      <w:tr>
+        <w:tc>
+          <w:tcPr>
+            <w:tcW w:type="dxa" w:w="2160"/>
+          </w:tcPr>
+          <w:p>
+            <w:r>
+              <w:t>RLS policies (public)</w:t>
+            </w:r>
+          </w:p>
+        </w:tc>
+        <w:tc>
+          <w:tcPr>
+            <w:tcW w:type="dxa" w:w="2160"/>
+          </w:tcPr>
+          <w:p>
+            <w:r>
+              <w:t>64 (old + new project)</w:t>
+            </w:r>
+          </w:p>
+        </w:tc>
+        <w:tc>
+          <w:tcPr>
+            <w:tcW w:type="dxa" w:w="2160"/>
+          </w:tcPr>
+          <w:p>
+            <w:r>
+              <w:t>64</w:t>
+            </w:r>
+          </w:p>
+        </w:tc>
+        <w:tc>
+          <w:tcPr>
+            <w:tcW w:type="dxa" w:w="2160"/>
+          </w:tcPr>
+          <w:p>
+            <w:r>
+              <w:t>✅</w:t>
+            </w:r>
+          </w:p>
+        </w:tc>
+      </w:tr>
+      <w:tr>
+        <w:tc>
+          <w:tcPr>
+            <w:tcW w:type="dxa" w:w="2160"/>
+            <w:shd w:fill="E8EAF6"/>
+          </w:tcPr>
+          <w:p>
+            <w:r>
+              <w:t>Triggers (public)</w:t>
+            </w:r>
+          </w:p>
+        </w:tc>
+        <w:tc>
+          <w:tcPr>
+            <w:tcW w:type="dxa" w:w="2160"/>
+            <w:shd w:fill="E8EAF6"/>
+          </w:tcPr>
+          <w:p>
+            <w:r>
+              <w:t>12</w:t>
+            </w:r>
+          </w:p>
+        </w:tc>
+        <w:tc>
+          <w:tcPr>
+            <w:tcW w:type="dxa" w:w="2160"/>
+            <w:shd w:fill="E8EAF6"/>
+          </w:tcPr>
+          <w:p>
+            <w:r>
+              <w:t>12</w:t>
+            </w:r>
+          </w:p>
+        </w:tc>
+        <w:tc>
+          <w:tcPr>
+            <w:tcW w:type="dxa" w:w="2160"/>
+            <w:shd w:fill="E8EAF6"/>
+          </w:tcPr>
+          <w:p>
+            <w:r>
+              <w:t>✅</w:t>
+            </w:r>
+          </w:p>
+        </w:tc>
+      </w:tr>
+    </w:tbl>
+    <w:p/>
+    <w:p>
+      <w:r>
+        <w:t>Note: Pre-flight report cited 73 policies; live count on both old and new projects is 64. All 20 public app tables have at least one policy — no tables with zero policies.</w:t>
+      </w:r>
+    </w:p>
+    <w:p>
+      <w:pPr>
+        <w:pStyle w:val="Heading2"/>
+      </w:pPr>
+      <w:r>
+        <w:t>10.4 Geofence Functions</w:t>
+      </w:r>
+    </w:p>
+    <w:tbl>
+      <w:tblPr>
+        <w:tblStyle w:val="TableGrid"/>
+        <w:tblW w:type="auto" w:w="0"/>
+        <w:tblLook w:firstColumn="1" w:firstRow="1" w:lastColumn="0" w:lastRow="0" w:noHBand="0" w:noVBand="1" w:val="04A0"/>
+      </w:tblPr>
+      <w:tblGrid>
+        <w:gridCol w:w="2880"/>
+        <w:gridCol w:w="2880"/>
+        <w:gridCol w:w="2880"/>
+      </w:tblGrid>
+      <w:tr>
+        <w:tc>
+          <w:tcPr>
+            <w:tcW w:type="dxa" w:w="2880"/>
+            <w:shd w:fill="1A237E"/>
+          </w:tcPr>
+          <w:p>
+            <w:r>
+              <w:rPr>
+                <w:b/>
+                <w:color w:val="FFFFFF"/>
+              </w:rPr>
+              <w:t>Function</w:t>
+            </w:r>
+          </w:p>
+        </w:tc>
+        <w:tc>
+          <w:tcPr>
+            <w:tcW w:type="dxa" w:w="2880"/>
+            <w:shd w:fill="1A237E"/>
+          </w:tcPr>
+          <w:p>
+            <w:r>
+              <w:rPr>
+                <w:b/>
+                <w:color w:val="FFFFFF"/>
+              </w:rPr>
+              <w:t>Test</w:t>
+            </w:r>
+          </w:p>
+        </w:tc>
+        <w:tc>
+          <w:tcPr>
+            <w:tcW w:type="dxa" w:w="2880"/>
+            <w:shd w:fill="1A237E"/>
+          </w:tcPr>
+          <w:p>
+            <w:r>
+              <w:rPr>
+                <w:b/>
+                <w:color w:val="FFFFFF"/>
+              </w:rPr>
+              <w:t>Result</w:t>
+            </w:r>
+          </w:p>
+        </w:tc>
+      </w:tr>
+      <w:tr>
+        <w:tc>
+          <w:tcPr>
+            <w:tcW w:type="dxa" w:w="2880"/>
+          </w:tcPr>
+          <w:p>
+            <w:r>
+              <w:t>was_officer_in_range(uuid)</w:t>
+            </w:r>
+          </w:p>
+        </w:tc>
+        <w:tc>
+          <w:tcPr>
+            <w:tcW w:type="dxa" w:w="2880"/>
+          </w:tcPr>
+          <w:p>
+            <w:r>
+              <w:t>Compiles and executes (auth guard active)</w:t>
+            </w:r>
+          </w:p>
+        </w:tc>
+        <w:tc>
+          <w:tcPr>
+            <w:tcW w:type="dxa" w:w="2880"/>
+          </w:tcPr>
+          <w:p>
+            <w:r>
+              <w:t>✅</w:t>
+            </w:r>
+          </w:p>
+        </w:tc>
+      </w:tr>
+      <w:tr>
+        <w:tc>
+          <w:tcPr>
+            <w:tcW w:type="dxa" w:w="2880"/>
+            <w:shd w:fill="E8EAF6"/>
+          </w:tcPr>
+          <w:p>
+            <w:r>
+              <w:t>compute_inspection_location_status(uuid)</w:t>
+            </w:r>
+          </w:p>
+        </w:tc>
+        <w:tc>
+          <w:tcPr>
+            <w:tcW w:type="dxa" w:w="2880"/>
+            <w:shd w:fill="E8EAF6"/>
+          </w:tcPr>
+          <w:p>
+            <w:r>
+              <w:t>Present in pg_proc (1 arg)</w:t>
+            </w:r>
+          </w:p>
+        </w:tc>
+        <w:tc>
+          <w:tcPr>
+            <w:tcW w:type="dxa" w:w="2880"/>
+            <w:shd w:fill="E8EAF6"/>
+          </w:tcPr>
+          <w:p>
+            <w:r>
+              <w:t>✅</w:t>
+            </w:r>
+          </w:p>
+        </w:tc>
+      </w:tr>
+      <w:tr>
+        <w:tc>
+          <w:tcPr>
+            <w:tcW w:type="dxa" w:w="2880"/>
+          </w:tcPr>
+          <w:p>
+            <w:r>
+              <w:t>PostGIS ST_DWithin</w:t>
+            </w:r>
+          </w:p>
+        </w:tc>
+        <w:tc>
+          <w:tcPr>
+            <w:tcW w:type="dxa" w:w="2880"/>
+          </w:tcPr>
+          <w:p>
+            <w:r>
+              <w:t>Same-point 100m radius</w:t>
+            </w:r>
+          </w:p>
+        </w:tc>
+        <w:tc>
+          <w:tcPr>
+            <w:tcW w:type="dxa" w:w="2880"/>
+          </w:tcPr>
+          <w:p>
+            <w:r>
+              <w:t>✅ true</w:t>
+            </w:r>
+          </w:p>
+        </w:tc>
+      </w:tr>
+    </w:tbl>
+    <w:p/>
+    <w:p>
+      <w:pPr>
+        <w:pStyle w:val="Heading2"/>
+      </w:pPr>
+      <w:r>
+        <w:t>10.5 Edge Function Health</w:t>
+      </w:r>
+    </w:p>
+    <w:tbl>
+      <w:tblPr>
+        <w:tblStyle w:val="TableGrid"/>
+        <w:tblW w:type="auto" w:w="0"/>
+        <w:tblLook w:firstColumn="1" w:firstRow="1" w:lastColumn="0" w:lastRow="0" w:noHBand="0" w:noVBand="1" w:val="04A0"/>
+      </w:tblPr>
+      <w:tblGrid>
+        <w:gridCol w:w="2160"/>
+        <w:gridCol w:w="2160"/>
+        <w:gridCol w:w="2160"/>
+        <w:gridCol w:w="2160"/>
+      </w:tblGrid>
+      <w:tr>
+        <w:tc>
+          <w:tcPr>
+            <w:tcW w:type="dxa" w:w="2160"/>
+            <w:shd w:fill="1A237E"/>
+          </w:tcPr>
+          <w:p>
+            <w:r>
+              <w:rPr>
+                <w:b/>
+                <w:color w:val="FFFFFF"/>
+              </w:rPr>
+              <w:t>Function</w:t>
+            </w:r>
+          </w:p>
+        </w:tc>
+        <w:tc>
+          <w:tcPr>
+            <w:tcW w:type="dxa" w:w="2160"/>
+            <w:shd w:fill="1A237E"/>
+          </w:tcPr>
+          <w:p>
+            <w:r>
+              <w:rPr>
+                <w:b/>
+                <w:color w:val="FFFFFF"/>
+              </w:rPr>
+              <w:t>HTTP Code</w:t>
+            </w:r>
+          </w:p>
+        </w:tc>
+        <w:tc>
+          <w:tcPr>
+            <w:tcW w:type="dxa" w:w="2160"/>
+            <w:shd w:fill="1A237E"/>
+          </w:tcPr>
+          <w:p>
+            <w:r>
+              <w:rPr>
+                <w:b/>
+                <w:color w:val="FFFFFF"/>
+              </w:rPr>
+              <w:t>Status</w:t>
+            </w:r>
+          </w:p>
+        </w:tc>
+        <w:tc>
+          <w:tcPr>
+            <w:tcW w:type="dxa" w:w="2160"/>
+            <w:shd w:fill="1A237E"/>
+          </w:tcPr>
+          <w:p>
+            <w:r>
+              <w:rPr>
+                <w:b/>
+                <w:color w:val="FFFFFF"/>
+              </w:rPr>
+              <w:t>Notes</w:t>
+            </w:r>
+          </w:p>
+        </w:tc>
+      </w:tr>
+      <w:tr>
+        <w:tc>
+          <w:tcPr>
+            <w:tcW w:type="dxa" w:w="2160"/>
+          </w:tcPr>
+          <w:p>
+            <w:r>
+              <w:t>health-check</w:t>
+            </w:r>
+          </w:p>
+        </w:tc>
+        <w:tc>
+          <w:tcPr>
+            <w:tcW w:type="dxa" w:w="2160"/>
+          </w:tcPr>
+          <w:p>
+            <w:r>
+              <w:t>200</w:t>
+            </w:r>
+          </w:p>
+        </w:tc>
+        <w:tc>
+          <w:tcPr>
+            <w:tcW w:type="dxa" w:w="2160"/>
+          </w:tcPr>
+          <w:p>
+            <w:r>
+              <w:t>✅</w:t>
+            </w:r>
+          </w:p>
+        </w:tc>
+        <w:tc>
+          <w:tcPr>
+            <w:tcW w:type="dxa" w:w="2160"/>
+          </w:tcPr>
+          <w:p>
+            <w:r>
+              <w:t>GET + x-cron-secret</w:t>
+            </w:r>
+          </w:p>
+        </w:tc>
+      </w:tr>
+      <w:tr>
+        <w:tc>
+          <w:tcPr>
+            <w:tcW w:type="dxa" w:w="2160"/>
+            <w:shd w:fill="E8EAF6"/>
+          </w:tcPr>
+          <w:p>
+            <w:r>
+              <w:t>on-inspection-submit</w:t>
+            </w:r>
+          </w:p>
+        </w:tc>
+        <w:tc>
+          <w:tcPr>
+            <w:tcW w:type="dxa" w:w="2160"/>
+            <w:shd w:fill="E8EAF6"/>
+          </w:tcPr>
+          <w:p>
+            <w:r>
+              <w:t>200</w:t>
+            </w:r>
+          </w:p>
+        </w:tc>
+        <w:tc>
+          <w:tcPr>
+            <w:tcW w:type="dxa" w:w="2160"/>
+            <w:shd w:fill="E8EAF6"/>
+          </w:tcPr>
+          <w:p>
+            <w:r>
+              <w:t>✅</w:t>
+            </w:r>
+          </w:p>
+        </w:tc>
+        <w:tc>
+          <w:tcPr>
+            <w:tcW w:type="dxa" w:w="2160"/>
+            <w:shd w:fill="E8EAF6"/>
+          </w:tcPr>
+          <w:p>
+            <w:r>
+              <w:t>Skipped (test payload); not 500</w:t>
+            </w:r>
+          </w:p>
+        </w:tc>
+      </w:tr>
+      <w:tr>
+        <w:tc>
+          <w:tcPr>
+            <w:tcW w:type="dxa" w:w="2160"/>
+          </w:tcPr>
+          <w:p>
+            <w:r>
+              <w:t>export-csv</w:t>
+            </w:r>
+          </w:p>
+        </w:tc>
+        <w:tc>
+          <w:tcPr>
+            <w:tcW w:type="dxa" w:w="2160"/>
+          </w:tcPr>
+          <w:p>
+            <w:r>
+              <w:t>200</w:t>
+            </w:r>
+          </w:p>
+        </w:tc>
+        <w:tc>
+          <w:tcPr>
+            <w:tcW w:type="dxa" w:w="2160"/>
+          </w:tcPr>
+          <w:p>
+            <w:r>
+              <w:t>✅</w:t>
+            </w:r>
+          </w:p>
+        </w:tc>
+        <w:tc>
+          <w:tcPr>
+            <w:tcW w:type="dxa" w:w="2160"/>
+          </w:tcPr>
+          <w:p>
+            <w:r>
+              <w:t>GET + anon JWT</w:t>
+            </w:r>
+          </w:p>
+        </w:tc>
+      </w:tr>
+      <w:tr>
+        <w:tc>
+          <w:tcPr>
+            <w:tcW w:type="dxa" w:w="2160"/>
+            <w:shd w:fill="E8EAF6"/>
+          </w:tcPr>
+          <w:p>
+            <w:r>
+              <w:t>supervisor-otp</w:t>
+            </w:r>
+          </w:p>
+        </w:tc>
+        <w:tc>
+          <w:tcPr>
+            <w:tcW w:type="dxa" w:w="2160"/>
+            <w:shd w:fill="E8EAF6"/>
+          </w:tcPr>
+          <w:p>
+            <w:r>
+              <w:t>400</w:t>
+            </w:r>
+          </w:p>
+        </w:tc>
+        <w:tc>
+          <w:tcPr>
+            <w:tcW w:type="dxa" w:w="2160"/>
+            <w:shd w:fill="E8EAF6"/>
+          </w:tcPr>
+          <w:p>
+            <w:r>
+              <w:t>✅</w:t>
+            </w:r>
+          </w:p>
+        </w:tc>
+        <w:tc>
+          <w:tcPr>
+            <w:tcW w:type="dxa" w:w="2160"/>
+            <w:shd w:fill="E8EAF6"/>
+          </w:tcPr>
+          <w:p>
+            <w:r>
+              <w:t>Unknown action — function alive</w:t>
+            </w:r>
+          </w:p>
+        </w:tc>
+      </w:tr>
+      <w:tr>
+        <w:tc>
+          <w:tcPr>
+            <w:tcW w:type="dxa" w:w="2160"/>
+          </w:tcPr>
+          <w:p>
+            <w:r>
+              <w:t>admin-create-user</w:t>
+            </w:r>
+          </w:p>
+        </w:tc>
+        <w:tc>
+          <w:tcPr>
+            <w:tcW w:type="dxa" w:w="2160"/>
+          </w:tcPr>
+          <w:p>
+            <w:r>
+              <w:t>401</w:t>
+            </w:r>
+          </w:p>
+        </w:tc>
+        <w:tc>
+          <w:tcPr>
+            <w:tcW w:type="dxa" w:w="2160"/>
+          </w:tcPr>
+          <w:p>
+            <w:r>
+              <w:t>✅</w:t>
+            </w:r>
+          </w:p>
+        </w:tc>
+        <w:tc>
+          <w:tcPr>
+            <w:tcW w:type="dxa" w:w="2160"/>
+          </w:tcPr>
+          <w:p>
+            <w:r>
+              <w:t>Requires admin user JWT (not service role)</w:t>
+            </w:r>
+          </w:p>
+        </w:tc>
+      </w:tr>
+      <w:tr>
+        <w:tc>
+          <w:tcPr>
+            <w:tcW w:type="dxa" w:w="2160"/>
+            <w:shd w:fill="E8EAF6"/>
+          </w:tcPr>
+          <w:p>
+            <w:r>
+              <w:t>admin-update-user</w:t>
+            </w:r>
+          </w:p>
+        </w:tc>
+        <w:tc>
+          <w:tcPr>
+            <w:tcW w:type="dxa" w:w="2160"/>
+            <w:shd w:fill="E8EAF6"/>
+          </w:tcPr>
+          <w:p>
+            <w:r>
+              <w:t>401</w:t>
+            </w:r>
+          </w:p>
+        </w:tc>
+        <w:tc>
+          <w:tcPr>
+            <w:tcW w:type="dxa" w:w="2160"/>
+            <w:shd w:fill="E8EAF6"/>
+          </w:tcPr>
+          <w:p>
+            <w:r>
+              <w:t>✅</w:t>
+            </w:r>
+          </w:p>
+        </w:tc>
+        <w:tc>
+          <w:tcPr>
+            <w:tcW w:type="dxa" w:w="2160"/>
+            <w:shd w:fill="E8EAF6"/>
+          </w:tcPr>
+          <w:p>
+            <w:r>
+              <w:t>Requires admin user JWT (not service role)</w:t>
+            </w:r>
+          </w:p>
+        </w:tc>
+      </w:tr>
+    </w:tbl>
+    <w:p/>
+    <w:p>
+      <w:r>
+        <w:t>Zero HTTP 500 responses across all tested functions.</w:t>
+      </w:r>
+    </w:p>
+    <w:p>
+      <w:pPr>
+        <w:pStyle w:val="Heading2"/>
+      </w:pPr>
+      <w:r>
+        <w:t>10.6 Smoke Test Results</w:t>
+      </w:r>
+    </w:p>
+    <w:tbl>
+      <w:tblPr>
+        <w:tblStyle w:val="TableGrid"/>
+        <w:tblW w:type="auto" w:w="0"/>
+        <w:tblLook w:firstColumn="1" w:firstRow="1" w:lastColumn="0" w:lastRow="0" w:noHBand="0" w:noVBand="1" w:val="04A0"/>
+      </w:tblPr>
+      <w:tblGrid>
+        <w:gridCol w:w="2160"/>
+        <w:gridCol w:w="2160"/>
+        <w:gridCol w:w="2160"/>
+        <w:gridCol w:w="2160"/>
+      </w:tblGrid>
+      <w:tr>
+        <w:tc>
+          <w:tcPr>
+            <w:tcW w:type="dxa" w:w="2160"/>
+            <w:shd w:fill="1A237E"/>
+          </w:tcPr>
+          <w:p>
+            <w:r>
+              <w:rPr>
+                <w:b/>
+                <w:color w:val="FFFFFF"/>
+              </w:rPr>
+              <w:t>Metric</w:t>
+            </w:r>
+          </w:p>
+        </w:tc>
+        <w:tc>
+          <w:tcPr>
+            <w:tcW w:type="dxa" w:w="2160"/>
+            <w:shd w:fill="1A237E"/>
+          </w:tcPr>
+          <w:p>
+            <w:r>
+              <w:rPr>
+                <w:b/>
+                <w:color w:val="FFFFFF"/>
+              </w:rPr>
+              <w:t>Expected</w:t>
+            </w:r>
+          </w:p>
+        </w:tc>
+        <w:tc>
+          <w:tcPr>
+            <w:tcW w:type="dxa" w:w="2160"/>
+            <w:shd w:fill="1A237E"/>
+          </w:tcPr>
+          <w:p>
+            <w:r>
+              <w:rPr>
+                <w:b/>
+                <w:color w:val="FFFFFF"/>
+              </w:rPr>
+              <w:t>Actual</w:t>
+            </w:r>
+          </w:p>
+        </w:tc>
+        <w:tc>
+          <w:tcPr>
+            <w:tcW w:type="dxa" w:w="2160"/>
+            <w:shd w:fill="1A237E"/>
+          </w:tcPr>
+          <w:p>
+            <w:r>
+              <w:rPr>
+                <w:b/>
+                <w:color w:val="FFFFFF"/>
+              </w:rPr>
+              <w:t>Status</w:t>
+            </w:r>
+          </w:p>
+        </w:tc>
+      </w:tr>
+      <w:tr>
+        <w:tc>
+          <w:tcPr>
+            <w:tcW w:type="dxa" w:w="2160"/>
+          </w:tcPr>
+          <w:p>
+            <w:r>
+              <w:t>public tables</w:t>
+            </w:r>
+          </w:p>
+        </w:tc>
+        <w:tc>
+          <w:tcPr>
+            <w:tcW w:type="dxa" w:w="2160"/>
+          </w:tcPr>
+          <w:p>
+            <w:r>
+              <w:t>20</w:t>
+            </w:r>
+          </w:p>
+        </w:tc>
+        <w:tc>
+          <w:tcPr>
+            <w:tcW w:type="dxa" w:w="2160"/>
+          </w:tcPr>
+          <w:p>
+            <w:r>
+              <w:t>20</w:t>
+            </w:r>
+          </w:p>
+        </w:tc>
+        <w:tc>
+          <w:tcPr>
+            <w:tcW w:type="dxa" w:w="2160"/>
+          </w:tcPr>
+          <w:p>
+            <w:r>
+              <w:t>✅</w:t>
+            </w:r>
+          </w:p>
+        </w:tc>
+      </w:tr>
+      <w:tr>
+        <w:tc>
+          <w:tcPr>
+            <w:tcW w:type="dxa" w:w="2160"/>
+            <w:shd w:fill="E8EAF6"/>
+          </w:tcPr>
+          <w:p>
+            <w:r>
+              <w:t>stores</w:t>
+            </w:r>
+          </w:p>
+        </w:tc>
+        <w:tc>
+          <w:tcPr>
+            <w:tcW w:type="dxa" w:w="2160"/>
+            <w:shd w:fill="E8EAF6"/>
+          </w:tcPr>
+          <w:p>
+            <w:r>
+              <w:t>80</w:t>
+            </w:r>
+          </w:p>
+        </w:tc>
+        <w:tc>
+          <w:tcPr>
+            <w:tcW w:type="dxa" w:w="2160"/>
+            <w:shd w:fill="E8EAF6"/>
+          </w:tcPr>
+          <w:p>
+            <w:r>
+              <w:t>80</w:t>
+            </w:r>
+          </w:p>
+        </w:tc>
+        <w:tc>
+          <w:tcPr>
+            <w:tcW w:type="dxa" w:w="2160"/>
+            <w:shd w:fill="E8EAF6"/>
+          </w:tcPr>
+          <w:p>
+            <w:r>
+              <w:t>✅</w:t>
+            </w:r>
+          </w:p>
+        </w:tc>
+      </w:tr>
+      <w:tr>
+        <w:tc>
+          <w:tcPr>
+            <w:tcW w:type="dxa" w:w="2160"/>
+          </w:tcPr>
+          <w:p>
+            <w:r>
+              <w:t>branches</w:t>
+            </w:r>
+          </w:p>
+        </w:tc>
+        <w:tc>
+          <w:tcPr>
+            <w:tcW w:type="dxa" w:w="2160"/>
+          </w:tcPr>
+          <w:p>
+            <w:r>
+              <w:t>91</w:t>
+            </w:r>
+          </w:p>
+        </w:tc>
+        <w:tc>
+          <w:tcPr>
+            <w:tcW w:type="dxa" w:w="2160"/>
+          </w:tcPr>
+          <w:p>
+            <w:r>
+              <w:t>91</w:t>
+            </w:r>
+          </w:p>
+        </w:tc>
+        <w:tc>
+          <w:tcPr>
+            <w:tcW w:type="dxa" w:w="2160"/>
+          </w:tcPr>
+          <w:p>
+            <w:r>
+              <w:t>✅</w:t>
+            </w:r>
+          </w:p>
+        </w:tc>
+      </w:tr>
+      <w:tr>
+        <w:tc>
+          <w:tcPr>
+            <w:tcW w:type="dxa" w:w="2160"/>
+            <w:shd w:fill="E8EAF6"/>
+          </w:tcPr>
+          <w:p>
+            <w:r>
+              <w:t>checklist_templates</w:t>
+            </w:r>
+          </w:p>
+        </w:tc>
+        <w:tc>
+          <w:tcPr>
+            <w:tcW w:type="dxa" w:w="2160"/>
+            <w:shd w:fill="E8EAF6"/>
+          </w:tcPr>
+          <w:p>
+            <w:r>
+              <w:t>32</w:t>
+            </w:r>
+          </w:p>
+        </w:tc>
+        <w:tc>
+          <w:tcPr>
+            <w:tcW w:type="dxa" w:w="2160"/>
+            <w:shd w:fill="E8EAF6"/>
+          </w:tcPr>
+          <w:p>
+            <w:r>
+              <w:t>32</w:t>
+            </w:r>
+          </w:p>
+        </w:tc>
+        <w:tc>
+          <w:tcPr>
+            <w:tcW w:type="dxa" w:w="2160"/>
+            <w:shd w:fill="E8EAF6"/>
+          </w:tcPr>
+          <w:p>
+            <w:r>
+              <w:t>✅</w:t>
+            </w:r>
+          </w:p>
+        </w:tc>
+      </w:tr>
+      <w:tr>
+        <w:tc>
+          <w:tcPr>
+            <w:tcW w:type="dxa" w:w="2160"/>
+          </w:tcPr>
+          <w:p>
+            <w:r>
+              <w:t>auth.users</w:t>
+            </w:r>
+          </w:p>
+        </w:tc>
+        <w:tc>
+          <w:tcPr>
+            <w:tcW w:type="dxa" w:w="2160"/>
+          </w:tcPr>
+          <w:p>
+            <w:r>
+              <w:t>5</w:t>
+            </w:r>
+          </w:p>
+        </w:tc>
+        <w:tc>
+          <w:tcPr>
+            <w:tcW w:type="dxa" w:w="2160"/>
+          </w:tcPr>
+          <w:p>
+            <w:r>
+              <w:t>5</w:t>
+            </w:r>
+          </w:p>
+        </w:tc>
+        <w:tc>
+          <w:tcPr>
+            <w:tcW w:type="dxa" w:w="2160"/>
+          </w:tcPr>
+          <w:p>
+            <w:r>
+              <w:t>✅</w:t>
+            </w:r>
+          </w:p>
+        </w:tc>
+      </w:tr>
+      <w:tr>
+        <w:tc>
+          <w:tcPr>
+            <w:tcW w:type="dxa" w:w="2160"/>
+            <w:shd w:fill="E8EAF6"/>
+          </w:tcPr>
+          <w:p>
+            <w:r>
+              <w:t>RLS policies</w:t>
+            </w:r>
+          </w:p>
+        </w:tc>
+        <w:tc>
+          <w:tcPr>
+            <w:tcW w:type="dxa" w:w="2160"/>
+            <w:shd w:fill="E8EAF6"/>
+          </w:tcPr>
+          <w:p>
+            <w:r>
+              <w:t>64</w:t>
+            </w:r>
+          </w:p>
+        </w:tc>
+        <w:tc>
+          <w:tcPr>
+            <w:tcW w:type="dxa" w:w="2160"/>
+            <w:shd w:fill="E8EAF6"/>
+          </w:tcPr>
+          <w:p>
+            <w:r>
+              <w:t>64</w:t>
+            </w:r>
+          </w:p>
+        </w:tc>
+        <w:tc>
+          <w:tcPr>
+            <w:tcW w:type="dxa" w:w="2160"/>
+            <w:shd w:fill="E8EAF6"/>
+          </w:tcPr>
+          <w:p>
+            <w:r>
+              <w:t>✅</w:t>
+            </w:r>
+          </w:p>
+        </w:tc>
+      </w:tr>
+      <w:tr>
+        <w:tc>
+          <w:tcPr>
+            <w:tcW w:type="dxa" w:w="2160"/>
+          </w:tcPr>
+          <w:p>
+            <w:r>
+              <w:t>triggers</w:t>
+            </w:r>
+          </w:p>
+        </w:tc>
+        <w:tc>
+          <w:tcPr>
+            <w:tcW w:type="dxa" w:w="2160"/>
+          </w:tcPr>
+          <w:p>
+            <w:r>
+              <w:t>12</w:t>
+            </w:r>
+          </w:p>
+        </w:tc>
+        <w:tc>
+          <w:tcPr>
+            <w:tcW w:type="dxa" w:w="2160"/>
+          </w:tcPr>
+          <w:p>
+            <w:r>
+              <w:t>12</w:t>
+            </w:r>
+          </w:p>
+        </w:tc>
+        <w:tc>
+          <w:tcPr>
+            <w:tcW w:type="dxa" w:w="2160"/>
+          </w:tcPr>
+          <w:p>
+            <w:r>
+              <w:t>✅</w:t>
+            </w:r>
+          </w:p>
+        </w:tc>
+      </w:tr>
+      <w:tr>
+        <w:tc>
+          <w:tcPr>
+            <w:tcW w:type="dxa" w:w="2160"/>
+            <w:shd w:fill="E8EAF6"/>
+          </w:tcPr>
+          <w:p>
+            <w:r>
+              <w:t>migrations</w:t>
+            </w:r>
+          </w:p>
+        </w:tc>
+        <w:tc>
+          <w:tcPr>
+            <w:tcW w:type="dxa" w:w="2160"/>
+            <w:shd w:fill="E8EAF6"/>
+          </w:tcPr>
+          <w:p>
+            <w:r>
+              <w:t>55</w:t>
+            </w:r>
+          </w:p>
+        </w:tc>
+        <w:tc>
+          <w:tcPr>
+            <w:tcW w:type="dxa" w:w="2160"/>
+            <w:shd w:fill="E8EAF6"/>
+          </w:tcPr>
+          <w:p>
+            <w:r>
+              <w:t>55</w:t>
+            </w:r>
+          </w:p>
+        </w:tc>
+        <w:tc>
+          <w:tcPr>
+            <w:tcW w:type="dxa" w:w="2160"/>
+            <w:shd w:fill="E8EAF6"/>
+          </w:tcPr>
+          <w:p>
+            <w:r>
+              <w:t>✅</w:t>
+            </w:r>
+          </w:p>
+        </w:tc>
+      </w:tr>
+    </w:tbl>
+    <w:p/>
+    <w:p>
+      <w:pPr>
+        <w:pStyle w:val="Heading2"/>
+      </w:pPr>
+      <w:r>
+        <w:t>10.7 Vercel &amp; EAS</w:t>
+      </w:r>
+    </w:p>
+    <w:tbl>
+      <w:tblPr>
+        <w:tblStyle w:val="TableGrid"/>
+        <w:tblW w:type="auto" w:w="0"/>
+        <w:tblLook w:firstColumn="1" w:firstRow="1" w:lastColumn="0" w:lastRow="0" w:noHBand="0" w:noVBand="1" w:val="04A0"/>
+      </w:tblPr>
+      <w:tblGrid>
+        <w:gridCol w:w="2880"/>
+        <w:gridCol w:w="2880"/>
+        <w:gridCol w:w="2880"/>
+      </w:tblGrid>
+      <w:tr>
+        <w:tc>
+          <w:tcPr>
+            <w:tcW w:type="dxa" w:w="2880"/>
+            <w:shd w:fill="1A237E"/>
+          </w:tcPr>
+          <w:p>
+            <w:r>
+              <w:rPr>
+                <w:b/>
+                <w:color w:val="FFFFFF"/>
+              </w:rPr>
+              <w:t>Service</w:t>
+            </w:r>
+          </w:p>
+        </w:tc>
+        <w:tc>
+          <w:tcPr>
+            <w:tcW w:type="dxa" w:w="2880"/>
+            <w:shd w:fill="1A237E"/>
+          </w:tcPr>
+          <w:p>
+            <w:r>
+              <w:rPr>
+                <w:b/>
+                <w:color w:val="FFFFFF"/>
+              </w:rPr>
+              <w:t>URL / ID</w:t>
+            </w:r>
+          </w:p>
+        </w:tc>
+        <w:tc>
+          <w:tcPr>
+            <w:tcW w:type="dxa" w:w="2880"/>
+            <w:shd w:fill="1A237E"/>
+          </w:tcPr>
+          <w:p>
+            <w:r>
+              <w:rPr>
+                <w:b/>
+                <w:color w:val="FFFFFF"/>
+              </w:rPr>
+              <w:t>Status</w:t>
+            </w:r>
+          </w:p>
+        </w:tc>
+      </w:tr>
+      <w:tr>
+        <w:tc>
+          <w:tcPr>
+            <w:tcW w:type="dxa" w:w="2880"/>
+          </w:tcPr>
+          <w:p>
+            <w:r>
+              <w:t>Vercel production</w:t>
+            </w:r>
+          </w:p>
+        </w:tc>
+        <w:tc>
+          <w:tcPr>
+            <w:tcW w:type="dxa" w:w="2880"/>
+          </w:tcPr>
+          <w:p>
+            <w:r>
+              <w:t>https://web-two-orcin-uy22un2bzf.vercel.app</w:t>
+            </w:r>
+          </w:p>
+        </w:tc>
+        <w:tc>
+          <w:tcPr>
+            <w:tcW w:type="dxa" w:w="2880"/>
+          </w:tcPr>
+          <w:p>
+            <w:r>
+              <w:t>HTTP 200 ✅</w:t>
+            </w:r>
+          </w:p>
+        </w:tc>
+      </w:tr>
+      <w:tr>
+        <w:tc>
+          <w:tcPr>
+            <w:tcW w:type="dxa" w:w="2880"/>
+            <w:shd w:fill="E8EAF6"/>
+          </w:tcPr>
+          <w:p>
+            <w:r>
+              <w:t>EAS Android preview</w:t>
+            </w:r>
+          </w:p>
+        </w:tc>
+        <w:tc>
+          <w:tcPr>
+            <w:tcW w:type="dxa" w:w="2880"/>
+            <w:shd w:fill="E8EAF6"/>
+          </w:tcPr>
+          <w:p>
+            <w:r>
+              <w:t>9e86637f-83fa-4f41-9aa1-10c24890cde2</w:t>
+            </w:r>
+          </w:p>
+        </w:tc>
+        <w:tc>
+          <w:tcPr>
+            <w:tcW w:type="dxa" w:w="2880"/>
+            <w:shd w:fill="E8EAF6"/>
+          </w:tcPr>
+          <w:p>
+            <w:r>
+              <w:t>FINISHED ✅</w:t>
+            </w:r>
+          </w:p>
+        </w:tc>
+      </w:tr>
+      <w:tr>
+        <w:tc>
+          <w:tcPr>
+            <w:tcW w:type="dxa" w:w="2880"/>
+          </w:tcPr>
+          <w:p>
+            <w:r>
+              <w:t>APK download</w:t>
+            </w:r>
+          </w:p>
+        </w:tc>
+        <w:tc>
+          <w:tcPr>
+            <w:tcW w:type="dxa" w:w="2880"/>
+          </w:tcPr>
+          <w:p>
+            <w:r>
+              <w:t>https://expo.dev/artifacts/eas/Q6RyDVFg-4LRXkD_VJR3b6hB7Ry5Nf_EGCn1jJKd0p0.apk</w:t>
+            </w:r>
+          </w:p>
+        </w:tc>
+        <w:tc>
+          <w:tcPr>
+            <w:tcW w:type="dxa" w:w="2880"/>
+          </w:tcPr>
+          <w:p>
+            <w:r>
+              <w:t>Available</w:t>
+            </w:r>
+          </w:p>
+        </w:tc>
+      </w:tr>
+    </w:tbl>
+    <w:p/>
+    <w:p>
+      <w:r>
+        <w:t>CRON_SECRET and WEBHOOK_SECRET were rotated during health verification (June 20, 2026). Values remain vault-only. Recreate the inspections database webhook with the new WEBHOOK_SECRET.</w:t>
+      </w:r>
+    </w:p>
+    <w:p>
+      <w:pPr>
+        <w:pStyle w:val="Heading1"/>
+      </w:pPr>
+      <w:r>
+        <w:t>Section 11 — Support Contact</w:t>
       </w:r>
     </w:p>
     <w:p>

</xml_diff>